<commit_message>
docs: embed actual gameplay screenshots into report.docx and generate updated pdf
</commit_message>
<xml_diff>
--- a/docs/report.docx
+++ b/docs/report.docx
@@ -1823,7 +1823,7 @@
           <w:i w:val="0"/>
           <w:sz w:val="32"/>
         </w:rPr>
-        <w:t>ส่วนนี้จัดทำพื้นที่สำหรับแทรกภาพถ่ายหน้าจอ (Screenshot) จากตัวเกมจริง เพื่อแสดงผลการทำงานและฟังก์ชันหลักของระบบ:</w:t>
+        <w:t>ภาพถ่ายหน้าจอแสดงผลการทำงานจริงของเกม AUGUSTUS BRUTAL ครอบคลุมทั้งหน้าจอเมนูหลัก, หน้าต่างแนะนำวิธีเล่น, หน้าจอข้อมูลผู้จัดทำ และการเผชิญหน้ากับกับดักในแต่ละด่าน:</w:t>
       </w:r>
     </w:p>
     <w:p>
@@ -1840,60 +1840,49 @@
         <w:t>ภาพที่ 1: หน้าจอเมนูหลัก (Main Menu Screen)</w:t>
       </w:r>
     </w:p>
-    <w:tbl>
-      <w:tblPr>
-        <w:tblW w:type="auto" w:w="0"/>
+    <w:p>
+      <w:pPr>
+        <w:spacing w:before="120" w:after="80"/>
         <w:jc w:val="center"/>
-        <w:tblLook w:firstColumn="1" w:firstRow="1" w:lastColumn="0" w:lastRow="0" w:noHBand="0" w:noVBand="1" w:val="04A0"/>
-      </w:tblPr>
-      <w:tblGrid>
-        <w:gridCol w:w="9360"/>
-      </w:tblGrid>
-      <w:tr>
-        <w:tc>
-          <w:tcPr>
-            <w:tcW w:type="dxa" w:w="8352"/>
-            <w:shd w:val="clear" w:color="auto" w:fill="F4F6F8"/>
-            <w:tcBorders>
-              <w:top w:val="single" w:sz="4" w:space="0" w:color="CCCCCC"/>
-              <w:left w:val="single" w:sz="4" w:space="0" w:color="CCCCCC"/>
-              <w:bottom w:val="single" w:sz="4" w:space="0" w:color="CCCCCC"/>
-              <w:right w:val="single" w:sz="4" w:space="0" w:color="CCCCCC"/>
-            </w:tcBorders>
-          </w:tcPr>
-          <w:p>
-            <w:pPr>
-              <w:spacing w:before="600" w:after="600"/>
-              <w:jc w:val="center"/>
-            </w:pPr>
-            <w:r>
-              <w:rPr>
-                <w:rFonts w:ascii="TH Sarabun New" w:hAnsi="TH Sarabun New" w:cs="TH Sarabun New" w:eastAsia="TH Sarabun New"/>
-                <w:b/>
-                <w:i w:val="0"/>
-                <w:color w:val="46505F"/>
-                <w:sz w:val="32"/>
-              </w:rPr>
-              <w:t>📷 [ ภาพที่ 1: หน้าจอเมนูหลัก (Main Menu Screen) ]</w:t>
-              <w:br/>
-            </w:r>
-            <w:r>
-              <w:rPr>
-                <w:rFonts w:ascii="TH Sarabun New" w:hAnsi="TH Sarabun New" w:cs="TH Sarabun New" w:eastAsia="TH Sarabun New"/>
-                <w:b w:val="0"/>
-                <w:i/>
-                <w:color w:val="788291"/>
-                <w:sz w:val="28"/>
-              </w:rPr>
-              <w:t>(คลิกขวาที่กล่องนี้เพื่อแทรกรูปภาพ หรือวางภาพหน้าจอของเกม)</w:t>
-            </w:r>
-          </w:p>
-        </w:tc>
-      </w:tr>
-    </w:tbl>
-    <w:p>
-      <w:pPr>
-        <w:spacing w:before="80" w:after="240"/>
+      </w:pPr>
+      <w:r>
+        <w:drawing>
+          <wp:inline xmlns:a="http://schemas.openxmlformats.org/drawingml/2006/main" xmlns:pic="http://schemas.openxmlformats.org/drawingml/2006/picture">
+            <wp:extent cx="5029200" cy="2827778"/>
+            <wp:docPr id="1" name="Picture 1"/>
+            <wp:cNvGraphicFramePr>
+              <a:graphicFrameLocks noChangeAspect="1"/>
+            </wp:cNvGraphicFramePr>
+            <a:graphic>
+              <a:graphicData uri="http://schemas.openxmlformats.org/drawingml/2006/picture">
+                <pic:pic>
+                  <pic:nvPicPr>
+                    <pic:cNvPr id="0" name="MainMenuScreen.png"/>
+                    <pic:cNvPicPr/>
+                  </pic:nvPicPr>
+                  <pic:blipFill>
+                    <a:blip r:embed="rId8"/>
+                    <a:stretch>
+                      <a:fillRect/>
+                    </a:stretch>
+                  </pic:blipFill>
+                  <pic:spPr>
+                    <a:xfrm>
+                      <a:off x="0" y="0"/>
+                      <a:ext cx="5029200" cy="2827778"/>
+                    </a:xfrm>
+                    <a:prstGeom prst="rect"/>
+                  </pic:spPr>
+                </pic:pic>
+              </a:graphicData>
+            </a:graphic>
+          </wp:inline>
+        </w:drawing>
+      </w:r>
+    </w:p>
+    <w:p>
+      <w:pPr>
+        <w:spacing w:before="40" w:after="280"/>
         <w:jc w:val="center"/>
       </w:pPr>
       <w:r>
@@ -1903,7 +1892,7 @@
           <w:i/>
           <w:sz w:val="28"/>
         </w:rPr>
-        <w:t>คำอธิบาย: แสดงชื่อเกม AUGUSTUS BRUTAL สไตล์เรโทรพิกเซลแบบ Flat คมชัด พร้อมปุ่ม START GAME, SELECT STAGE, HOW TO PLAY, และ ABOUT / ผู้จัดทำ</w:t>
+        <w:t>คำอธิบาย: แสดงชื่อเกม "AUGUSTUS BRUTAL" สไตล์เรโทรพิกเซลแบบ Flat คมชัด พร้อมปุ่มตัวเลือก START GAME, SELECT STAGE, HOW TO PLAY, และ ABOUT / ผู้จัดทำ</w:t>
       </w:r>
     </w:p>
     <w:p>
@@ -1917,63 +1906,52 @@
           <w:i w:val="0"/>
           <w:sz w:val="32"/>
         </w:rPr>
-        <w:t>ภาพที่ 2: หน้าต่างวิธีเล่นและข้อมูลผู้จัดทำ (How to Play &amp; About Screen)</w:t>
-      </w:r>
-    </w:p>
-    <w:tbl>
-      <w:tblPr>
-        <w:tblW w:type="auto" w:w="0"/>
+        <w:t>ภาพที่ 2: หน้าต่างวิธีเล่น (How to Play Screen)</w:t>
+      </w:r>
+    </w:p>
+    <w:p>
+      <w:pPr>
+        <w:spacing w:before="120" w:after="80"/>
         <w:jc w:val="center"/>
-        <w:tblLook w:firstColumn="1" w:firstRow="1" w:lastColumn="0" w:lastRow="0" w:noHBand="0" w:noVBand="1" w:val="04A0"/>
-      </w:tblPr>
-      <w:tblGrid>
-        <w:gridCol w:w="9360"/>
-      </w:tblGrid>
-      <w:tr>
-        <w:tc>
-          <w:tcPr>
-            <w:tcW w:type="dxa" w:w="8352"/>
-            <w:shd w:val="clear" w:color="auto" w:fill="F4F6F8"/>
-            <w:tcBorders>
-              <w:top w:val="single" w:sz="4" w:space="0" w:color="CCCCCC"/>
-              <w:left w:val="single" w:sz="4" w:space="0" w:color="CCCCCC"/>
-              <w:bottom w:val="single" w:sz="4" w:space="0" w:color="CCCCCC"/>
-              <w:right w:val="single" w:sz="4" w:space="0" w:color="CCCCCC"/>
-            </w:tcBorders>
-          </w:tcPr>
-          <w:p>
-            <w:pPr>
-              <w:spacing w:before="600" w:after="600"/>
-              <w:jc w:val="center"/>
-            </w:pPr>
-            <w:r>
-              <w:rPr>
-                <w:rFonts w:ascii="TH Sarabun New" w:hAnsi="TH Sarabun New" w:cs="TH Sarabun New" w:eastAsia="TH Sarabun New"/>
-                <w:b/>
-                <w:i w:val="0"/>
-                <w:color w:val="46505F"/>
-                <w:sz w:val="32"/>
-              </w:rPr>
-              <w:t>📷 [ ภาพที่ 2: หน้าต่างวิธีเล่นและข้อมูลผู้จัดทำ (How to Play &amp; About Screen) ]</w:t>
-              <w:br/>
-            </w:r>
-            <w:r>
-              <w:rPr>
-                <w:rFonts w:ascii="TH Sarabun New" w:hAnsi="TH Sarabun New" w:cs="TH Sarabun New" w:eastAsia="TH Sarabun New"/>
-                <w:b w:val="0"/>
-                <w:i/>
-                <w:color w:val="788291"/>
-                <w:sz w:val="28"/>
-              </w:rPr>
-              <w:t>(คลิกขวาที่กล่องนี้เพื่อแทรกรูปภาพ หรือวางภาพหน้าจอของเกม)</w:t>
-            </w:r>
-          </w:p>
-        </w:tc>
-      </w:tr>
-    </w:tbl>
-    <w:p>
-      <w:pPr>
-        <w:spacing w:before="80" w:after="240"/>
+      </w:pPr>
+      <w:r>
+        <w:drawing>
+          <wp:inline xmlns:a="http://schemas.openxmlformats.org/drawingml/2006/main" xmlns:pic="http://schemas.openxmlformats.org/drawingml/2006/picture">
+            <wp:extent cx="5029200" cy="2827778"/>
+            <wp:docPr id="2" name="Picture 2"/>
+            <wp:cNvGraphicFramePr>
+              <a:graphicFrameLocks noChangeAspect="1"/>
+            </wp:cNvGraphicFramePr>
+            <a:graphic>
+              <a:graphicData uri="http://schemas.openxmlformats.org/drawingml/2006/picture">
+                <pic:pic>
+                  <pic:nvPicPr>
+                    <pic:cNvPr id="0" name="HowToPlay.png"/>
+                    <pic:cNvPicPr/>
+                  </pic:nvPicPr>
+                  <pic:blipFill>
+                    <a:blip r:embed="rId9"/>
+                    <a:stretch>
+                      <a:fillRect/>
+                    </a:stretch>
+                  </pic:blipFill>
+                  <pic:spPr>
+                    <a:xfrm>
+                      <a:off x="0" y="0"/>
+                      <a:ext cx="5029200" cy="2827778"/>
+                    </a:xfrm>
+                    <a:prstGeom prst="rect"/>
+                  </pic:spPr>
+                </pic:pic>
+              </a:graphicData>
+            </a:graphic>
+          </wp:inline>
+        </w:drawing>
+      </w:r>
+    </w:p>
+    <w:p>
+      <w:pPr>
+        <w:spacing w:before="40" w:after="280"/>
         <w:jc w:val="center"/>
       </w:pPr>
       <w:r>
@@ -1983,7 +1961,7 @@
           <w:i/>
           <w:sz w:val="28"/>
         </w:rPr>
-        <w:t>คำอธิบาย: แสดงคำแนะนำการควบคุมทั้ง Keyboard และ Touch Screen พร้อมรายชื่อสมาชิกกลุ่ม Developer Team</w:t>
+        <w:t>คำอธิบาย: แสดงคำแนะนำการควบคุมทั้ง Keyboard สำหรับ PC/Web (A/D, Space/Shift, R, H) และระบบ Virtual Controls สำหรับหน้าจอสัมผัสบน Mobile พร้อมคำแนะนำปรัชญาการเล่นสไตล์ Masocore</w:t>
       </w:r>
     </w:p>
     <w:p>
@@ -1997,63 +1975,52 @@
           <w:i w:val="0"/>
           <w:sz w:val="32"/>
         </w:rPr>
-        <w:t>ภาพที่ 3: ด่านที่ 1 - สวนผลไม้ลวงตา (Stage 1: Orchard of Deception)</w:t>
-      </w:r>
-    </w:p>
-    <w:tbl>
-      <w:tblPr>
-        <w:tblW w:type="auto" w:w="0"/>
+        <w:t>ภาพที่ 3: หน้าจอข้อมูลผู้จัดทำ (About Screen)</w:t>
+      </w:r>
+    </w:p>
+    <w:p>
+      <w:pPr>
+        <w:spacing w:before="120" w:after="80"/>
         <w:jc w:val="center"/>
-        <w:tblLook w:firstColumn="1" w:firstRow="1" w:lastColumn="0" w:lastRow="0" w:noHBand="0" w:noVBand="1" w:val="04A0"/>
-      </w:tblPr>
-      <w:tblGrid>
-        <w:gridCol w:w="9360"/>
-      </w:tblGrid>
-      <w:tr>
-        <w:tc>
-          <w:tcPr>
-            <w:tcW w:type="dxa" w:w="8352"/>
-            <w:shd w:val="clear" w:color="auto" w:fill="F4F6F8"/>
-            <w:tcBorders>
-              <w:top w:val="single" w:sz="4" w:space="0" w:color="CCCCCC"/>
-              <w:left w:val="single" w:sz="4" w:space="0" w:color="CCCCCC"/>
-              <w:bottom w:val="single" w:sz="4" w:space="0" w:color="CCCCCC"/>
-              <w:right w:val="single" w:sz="4" w:space="0" w:color="CCCCCC"/>
-            </w:tcBorders>
-          </w:tcPr>
-          <w:p>
-            <w:pPr>
-              <w:spacing w:before="600" w:after="600"/>
-              <w:jc w:val="center"/>
-            </w:pPr>
-            <w:r>
-              <w:rPr>
-                <w:rFonts w:ascii="TH Sarabun New" w:hAnsi="TH Sarabun New" w:cs="TH Sarabun New" w:eastAsia="TH Sarabun New"/>
-                <w:b/>
-                <w:i w:val="0"/>
-                <w:color w:val="46505F"/>
-                <w:sz w:val="32"/>
-              </w:rPr>
-              <w:t>📷 [ ภาพที่ 3: ด่านที่ 1 - สวนผลไม้ลวงตา (Stage 1: Orchard of Deception) ]</w:t>
-              <w:br/>
-            </w:r>
-            <w:r>
-              <w:rPr>
-                <w:rFonts w:ascii="TH Sarabun New" w:hAnsi="TH Sarabun New" w:cs="TH Sarabun New" w:eastAsia="TH Sarabun New"/>
-                <w:b w:val="0"/>
-                <w:i/>
-                <w:color w:val="788291"/>
-                <w:sz w:val="28"/>
-              </w:rPr>
-              <w:t>(คลิกขวาที่กล่องนี้เพื่อแทรกรูปภาพ หรือวางภาพหน้าจอของเกม)</w:t>
-            </w:r>
-          </w:p>
-        </w:tc>
-      </w:tr>
-    </w:tbl>
-    <w:p>
-      <w:pPr>
-        <w:spacing w:before="80" w:after="240"/>
+      </w:pPr>
+      <w:r>
+        <w:drawing>
+          <wp:inline xmlns:a="http://schemas.openxmlformats.org/drawingml/2006/main" xmlns:pic="http://schemas.openxmlformats.org/drawingml/2006/picture">
+            <wp:extent cx="5029200" cy="2832206"/>
+            <wp:docPr id="3" name="Picture 3"/>
+            <wp:cNvGraphicFramePr>
+              <a:graphicFrameLocks noChangeAspect="1"/>
+            </wp:cNvGraphicFramePr>
+            <a:graphic>
+              <a:graphicData uri="http://schemas.openxmlformats.org/drawingml/2006/picture">
+                <pic:pic>
+                  <pic:nvPicPr>
+                    <pic:cNvPr id="0" name="About.png"/>
+                    <pic:cNvPicPr/>
+                  </pic:nvPicPr>
+                  <pic:blipFill>
+                    <a:blip r:embed="rId10"/>
+                    <a:stretch>
+                      <a:fillRect/>
+                    </a:stretch>
+                  </pic:blipFill>
+                  <pic:spPr>
+                    <a:xfrm>
+                      <a:off x="0" y="0"/>
+                      <a:ext cx="5029200" cy="2832206"/>
+                    </a:xfrm>
+                    <a:prstGeom prst="rect"/>
+                  </pic:spPr>
+                </pic:pic>
+              </a:graphicData>
+            </a:graphic>
+          </wp:inline>
+        </w:drawing>
+      </w:r>
+    </w:p>
+    <w:p>
+      <w:pPr>
+        <w:spacing w:before="40" w:after="280"/>
         <w:jc w:val="center"/>
       </w:pPr>
       <w:r>
@@ -2063,7 +2030,7 @@
           <w:i/>
           <w:sz w:val="28"/>
         </w:rPr>
-        <w:t>คำอธิบาย: แสดงกับดักผลไม้สวนแรงโน้มถ่วง, หนามสไลด์ไป-กลับ และการเปิดโหมด Debug Hitbox แสดงกรอบตรวจจับ</w:t>
+        <w:t>คำอธิบาย: แสดงข้อมูลรายวิชา สาขาวิชา คณะ สถาบัน อาจารย์ผู้สอน และรายชื่อสมาชิกกลุ่ม Developer Team (นายชัชชัย นาคแท้ และ นายปุณยกร ธรรมวงษ์) พร้อมปุ่มย้อนกลับลูกศรชี้ซ้าย</w:t>
       </w:r>
     </w:p>
     <w:p>
@@ -2077,63 +2044,52 @@
           <w:i w:val="0"/>
           <w:sz w:val="32"/>
         </w:rPr>
-        <w:t>ภาพที่ 4: ด่านที่ 2 &amp; 3 - กับดักหนามและป้อมปืนกล (Spike Maze &amp; Leap of Faith)</w:t>
-      </w:r>
-    </w:p>
-    <w:tbl>
-      <w:tblPr>
-        <w:tblW w:type="auto" w:w="0"/>
+        <w:t>ภาพที่ 4: ด่านที่ 1 - สวนผลไม้ลวงตา (Stage 1: Orchard of Deception)</w:t>
+      </w:r>
+    </w:p>
+    <w:p>
+      <w:pPr>
+        <w:spacing w:before="120" w:after="80"/>
         <w:jc w:val="center"/>
-        <w:tblLook w:firstColumn="1" w:firstRow="1" w:lastColumn="0" w:lastRow="0" w:noHBand="0" w:noVBand="1" w:val="04A0"/>
-      </w:tblPr>
-      <w:tblGrid>
-        <w:gridCol w:w="9360"/>
-      </w:tblGrid>
-      <w:tr>
-        <w:tc>
-          <w:tcPr>
-            <w:tcW w:type="dxa" w:w="8352"/>
-            <w:shd w:val="clear" w:color="auto" w:fill="F4F6F8"/>
-            <w:tcBorders>
-              <w:top w:val="single" w:sz="4" w:space="0" w:color="CCCCCC"/>
-              <w:left w:val="single" w:sz="4" w:space="0" w:color="CCCCCC"/>
-              <w:bottom w:val="single" w:sz="4" w:space="0" w:color="CCCCCC"/>
-              <w:right w:val="single" w:sz="4" w:space="0" w:color="CCCCCC"/>
-            </w:tcBorders>
-          </w:tcPr>
-          <w:p>
-            <w:pPr>
-              <w:spacing w:before="600" w:after="600"/>
-              <w:jc w:val="center"/>
-            </w:pPr>
-            <w:r>
-              <w:rPr>
-                <w:rFonts w:ascii="TH Sarabun New" w:hAnsi="TH Sarabun New" w:cs="TH Sarabun New" w:eastAsia="TH Sarabun New"/>
-                <w:b/>
-                <w:i w:val="0"/>
-                <w:color w:val="46505F"/>
-                <w:sz w:val="32"/>
-              </w:rPr>
-              <w:t>📷 [ ภาพที่ 4: ด่านที่ 2 &amp; 3 - กับดักหนามและป้อมปืนกล (Spike Maze &amp; Leap of Faith) ]</w:t>
-              <w:br/>
-            </w:r>
-            <w:r>
-              <w:rPr>
-                <w:rFonts w:ascii="TH Sarabun New" w:hAnsi="TH Sarabun New" w:cs="TH Sarabun New" w:eastAsia="TH Sarabun New"/>
-                <w:b w:val="0"/>
-                <w:i/>
-                <w:color w:val="788291"/>
-                <w:sz w:val="28"/>
-              </w:rPr>
-              <w:t>(คลิกขวาที่กล่องนี้เพื่อแทรกรูปภาพ หรือวางภาพหน้าจอของเกม)</w:t>
-            </w:r>
-          </w:p>
-        </w:tc>
-      </w:tr>
-    </w:tbl>
-    <w:p>
-      <w:pPr>
-        <w:spacing w:before="80" w:after="240"/>
+      </w:pPr>
+      <w:r>
+        <w:drawing>
+          <wp:inline xmlns:a="http://schemas.openxmlformats.org/drawingml/2006/main" xmlns:pic="http://schemas.openxmlformats.org/drawingml/2006/picture">
+            <wp:extent cx="5029200" cy="2827778"/>
+            <wp:docPr id="4" name="Picture 4"/>
+            <wp:cNvGraphicFramePr>
+              <a:graphicFrameLocks noChangeAspect="1"/>
+            </wp:cNvGraphicFramePr>
+            <a:graphic>
+              <a:graphicData uri="http://schemas.openxmlformats.org/drawingml/2006/picture">
+                <pic:pic>
+                  <pic:nvPicPr>
+                    <pic:cNvPr id="0" name="Stage1.png"/>
+                    <pic:cNvPicPr/>
+                  </pic:nvPicPr>
+                  <pic:blipFill>
+                    <a:blip r:embed="rId11"/>
+                    <a:stretch>
+                      <a:fillRect/>
+                    </a:stretch>
+                  </pic:blipFill>
+                  <pic:spPr>
+                    <a:xfrm>
+                      <a:off x="0" y="0"/>
+                      <a:ext cx="5029200" cy="2827778"/>
+                    </a:xfrm>
+                    <a:prstGeom prst="rect"/>
+                  </pic:spPr>
+                </pic:pic>
+              </a:graphicData>
+            </a:graphic>
+          </wp:inline>
+        </w:drawing>
+      </w:r>
+    </w:p>
+    <w:p>
+      <w:pPr>
+        <w:spacing w:before="40" w:after="280"/>
         <w:jc w:val="center"/>
       </w:pPr>
       <w:r>
@@ -2143,7 +2099,145 @@
           <w:i/>
           <w:sz w:val="28"/>
         </w:rPr>
-        <w:t>คำอธิบาย: แสดงระบบป้อมปืนกลกวาดองศาการเล็ง (Turret Hazard) และสไนเปอร์เลเซอร์ล็อกเป้า</w:t>
+        <w:t>คำอธิบาย: แสดงสภาพแวดล้อมด่านที่ 1 กับดักแอปเปิ้ลพุ่งสวนแรงโน้มถ่วง, หนามสไลด์บนแท่นหิน, และระบบแถบ HUD ด้านบนพร้อมปุ่มเปิด/ปิด Debug Hitbox และ Virtual Controls</w:t>
+      </w:r>
+    </w:p>
+    <w:p>
+      <w:pPr>
+        <w:spacing w:before="200" w:after="80" w:line="276" w:lineRule="auto"/>
+      </w:pPr>
+      <w:r>
+        <w:rPr>
+          <w:rFonts w:ascii="TH Sarabun New" w:hAnsi="TH Sarabun New" w:cs="TH Sarabun New" w:eastAsia="TH Sarabun New"/>
+          <w:b/>
+          <w:i w:val="0"/>
+          <w:sz w:val="32"/>
+        </w:rPr>
+        <w:t>ภาพที่ 5: ด่านที่ 2 - เขาวงกตหนามบิน (Stage 2: Spike Maze)</w:t>
+      </w:r>
+    </w:p>
+    <w:p>
+      <w:pPr>
+        <w:spacing w:before="120" w:after="80"/>
+        <w:jc w:val="center"/>
+      </w:pPr>
+      <w:r>
+        <w:drawing>
+          <wp:inline xmlns:a="http://schemas.openxmlformats.org/drawingml/2006/main" xmlns:pic="http://schemas.openxmlformats.org/drawingml/2006/picture">
+            <wp:extent cx="5029200" cy="2827778"/>
+            <wp:docPr id="5" name="Picture 5"/>
+            <wp:cNvGraphicFramePr>
+              <a:graphicFrameLocks noChangeAspect="1"/>
+            </wp:cNvGraphicFramePr>
+            <a:graphic>
+              <a:graphicData uri="http://schemas.openxmlformats.org/drawingml/2006/picture">
+                <pic:pic>
+                  <pic:nvPicPr>
+                    <pic:cNvPr id="0" name="Stage2.png"/>
+                    <pic:cNvPicPr/>
+                  </pic:nvPicPr>
+                  <pic:blipFill>
+                    <a:blip r:embed="rId12"/>
+                    <a:stretch>
+                      <a:fillRect/>
+                    </a:stretch>
+                  </pic:blipFill>
+                  <pic:spPr>
+                    <a:xfrm>
+                      <a:off x="0" y="0"/>
+                      <a:ext cx="5029200" cy="2827778"/>
+                    </a:xfrm>
+                    <a:prstGeom prst="rect"/>
+                  </pic:spPr>
+                </pic:pic>
+              </a:graphicData>
+            </a:graphic>
+          </wp:inline>
+        </w:drawing>
+      </w:r>
+    </w:p>
+    <w:p>
+      <w:pPr>
+        <w:spacing w:before="40" w:after="280"/>
+        <w:jc w:val="center"/>
+      </w:pPr>
+      <w:r>
+        <w:rPr>
+          <w:rFonts w:ascii="TH Sarabun New" w:hAnsi="TH Sarabun New" w:cs="TH Sarabun New" w:eastAsia="TH Sarabun New"/>
+          <w:b w:val="0"/>
+          <w:i/>
+          <w:sz w:val="28"/>
+        </w:rPr>
+        <w:t>คำอธิบาย: แสดงความท้าทายของด่านที่ 2 กับดักหนามพุ่งทะลุฉากด้วยความเร็วสูง (Rushers) และการควบคุมจังหวะการกระโดด Double Jump หลบหนามกลางอากาศในช่องทางแคบ</w:t>
+      </w:r>
+    </w:p>
+    <w:p>
+      <w:pPr>
+        <w:spacing w:before="200" w:after="80" w:line="276" w:lineRule="auto"/>
+      </w:pPr>
+      <w:r>
+        <w:rPr>
+          <w:rFonts w:ascii="TH Sarabun New" w:hAnsi="TH Sarabun New" w:cs="TH Sarabun New" w:eastAsia="TH Sarabun New"/>
+          <w:b/>
+          <w:i w:val="0"/>
+          <w:sz w:val="32"/>
+        </w:rPr>
+        <w:t>ภาพที่ 6: ด่านที่ 3 - กระโดดวัดใจและป้อมปืนกล (Stage 3: Leap of Faith &amp; Turret Arena)</w:t>
+      </w:r>
+    </w:p>
+    <w:p>
+      <w:pPr>
+        <w:spacing w:before="120" w:after="80"/>
+        <w:jc w:val="center"/>
+      </w:pPr>
+      <w:r>
+        <w:drawing>
+          <wp:inline xmlns:a="http://schemas.openxmlformats.org/drawingml/2006/main" xmlns:pic="http://schemas.openxmlformats.org/drawingml/2006/picture">
+            <wp:extent cx="5029200" cy="2827778"/>
+            <wp:docPr id="6" name="Picture 6"/>
+            <wp:cNvGraphicFramePr>
+              <a:graphicFrameLocks noChangeAspect="1"/>
+            </wp:cNvGraphicFramePr>
+            <a:graphic>
+              <a:graphicData uri="http://schemas.openxmlformats.org/drawingml/2006/picture">
+                <pic:pic>
+                  <pic:nvPicPr>
+                    <pic:cNvPr id="0" name="Stage3.png"/>
+                    <pic:cNvPicPr/>
+                  </pic:nvPicPr>
+                  <pic:blipFill>
+                    <a:blip r:embed="rId13"/>
+                    <a:stretch>
+                      <a:fillRect/>
+                    </a:stretch>
+                  </pic:blipFill>
+                  <pic:spPr>
+                    <a:xfrm>
+                      <a:off x="0" y="0"/>
+                      <a:ext cx="5029200" cy="2827778"/>
+                    </a:xfrm>
+                    <a:prstGeom prst="rect"/>
+                  </pic:spPr>
+                </pic:pic>
+              </a:graphicData>
+            </a:graphic>
+          </wp:inline>
+        </w:drawing>
+      </w:r>
+    </w:p>
+    <w:p>
+      <w:pPr>
+        <w:spacing w:before="40" w:after="280"/>
+        <w:jc w:val="center"/>
+      </w:pPr>
+      <w:r>
+        <w:rPr>
+          <w:rFonts w:ascii="TH Sarabun New" w:hAnsi="TH Sarabun New" w:cs="TH Sarabun New" w:eastAsia="TH Sarabun New"/>
+          <w:b w:val="0"/>
+          <w:i/>
+          <w:sz w:val="28"/>
+        </w:rPr>
+        <w:t>คำอธิบาย: แสดงระบบป้อมปืนกลกวาดองศาการเล็ง (Turret Hazard), เลเซอร์สไนเปอร์ล็อกเป้า, และการกระโดดวัดใจข้ามเหวลึกผ่านแท่นกระโดดที่ต้องการความแม่นยำระดับพิกเซล</w:t>
       </w:r>
     </w:p>
     <w:p>

</xml_diff>

<commit_message>
feat: implement 2D Stage Editor, Character Customization, Career Stats and Hybrid Data Storage
</commit_message>
<xml_diff>
--- a/docs/report.docx
+++ b/docs/report.docx
@@ -222,33 +222,16 @@
           <w:sz w:val="32"/>
           <w:szCs w:val="32"/>
         </w:rPr>
-        <w:t xml:space="preserve"> 016830641008-0</w:t>
-      </w:r>
-      <w:r>
-        <w:rPr>
-          <w:rFonts w:ascii="TH Sarabun New" w:hAnsi="TH Sarabun New" w:cs="TH Sarabun New"/>
-          <w:sz w:val="32"/>
-          <w:szCs w:val="32"/>
-        </w:rPr>
-        <w:t xml:space="preserve"> </w:t>
-      </w:r>
-      <w:r>
-        <w:rPr>
-          <w:rFonts w:ascii="TH Sarabun New" w:hAnsi="TH Sarabun New" w:cs="TH Sarabun New"/>
-          <w:sz w:val="32"/>
-          <w:szCs w:val="32"/>
-          <w:cs/>
-        </w:rPr>
-        <w:t>ชื่อ</w:t>
-      </w:r>
-      <w:r>
-        <w:rPr>
-          <w:rFonts w:ascii="TH Sarabun New" w:hAnsi="TH Sarabun New" w:cs="TH Sarabun New"/>
-          <w:sz w:val="32"/>
-          <w:szCs w:val="32"/>
-          <w:cs/>
-        </w:rPr>
-        <w:t xml:space="preserve"> นาย</w:t>
+        <w:t xml:space="preserve"> 016830641008-0 </w:t>
+      </w:r>
+      <w:r>
+        <w:rPr>
+          <w:rFonts w:ascii="TH Sarabun New" w:hAnsi="TH Sarabun New" w:cs="TH Sarabun New"/>
+          <w:sz w:val="32"/>
+          <w:szCs w:val="32"/>
+          <w:cs/>
+        </w:rPr>
+        <w:t>ชื่อ นาย</w:t>
       </w:r>
       <w:proofErr w:type="spellStart"/>
       <w:r>
@@ -313,25 +296,7 @@
           <w:szCs w:val="32"/>
           <w:cs/>
         </w:rPr>
-        <w:t>ชื่อ</w:t>
-      </w:r>
-      <w:r>
-        <w:rPr>
-          <w:rFonts w:ascii="TH Sarabun New" w:hAnsi="TH Sarabun New" w:cs="TH Sarabun New"/>
-          <w:sz w:val="32"/>
-          <w:szCs w:val="32"/>
-          <w:cs/>
-        </w:rPr>
-        <w:t xml:space="preserve"> </w:t>
-      </w:r>
-      <w:r>
-        <w:rPr>
-          <w:rFonts w:ascii="TH Sarabun New" w:hAnsi="TH Sarabun New" w:cs="TH Sarabun New"/>
-          <w:sz w:val="32"/>
-          <w:szCs w:val="32"/>
-          <w:cs/>
-        </w:rPr>
-        <w:t>นายปุณยกร ธรรมวงษ์</w:t>
+        <w:t>ชื่อ นายปุณยกร ธรรมวงษ์</w:t>
       </w:r>
     </w:p>
     <w:p>
@@ -1690,9 +1655,8 @@
       </w:pPr>
       <w:r>
         <w:rPr>
-          <w:rFonts w:ascii="TH Sarabun New" w:hAnsi="TH Sarabun New" w:cs="TH Sarabun New" w:eastAsia="TH Sarabun New"/>
-          <w:b/>
-          <w:i w:val="0"/>
+          <w:rFonts w:ascii="TH Sarabun New" w:eastAsia="TH Sarabun New" w:hAnsi="TH Sarabun New" w:cs="TH Sarabun New"/>
+          <w:b/>
           <w:sz w:val="32"/>
         </w:rPr>
         <w:t>ระบบการจำลองเลือด (Procedural Raycast Blood Physics):</w:t>
@@ -1700,23 +1664,20 @@
     </w:p>
     <w:p>
       <w:pPr>
-        <w:spacing w:before="0" w:after="120" w:line="276" w:lineRule="auto"/>
+        <w:spacing w:after="120" w:line="276" w:lineRule="auto"/>
         <w:ind w:left="360"/>
       </w:pPr>
       <w:r>
         <w:rPr>
-          <w:rFonts w:ascii="TH Sarabun New" w:hAnsi="TH Sarabun New" w:cs="TH Sarabun New" w:eastAsia="TH Sarabun New"/>
-          <w:b/>
-          <w:i w:val="0"/>
+          <w:rFonts w:ascii="TH Sarabun New" w:eastAsia="TH Sarabun New" w:hAnsi="TH Sarabun New" w:cs="TH Sarabun New"/>
+          <w:b/>
           <w:sz w:val="32"/>
         </w:rPr>
         <w:t xml:space="preserve">• Raycast Surface Sticking: </w:t>
       </w:r>
       <w:r>
         <w:rPr>
-          <w:rFonts w:ascii="TH Sarabun New" w:hAnsi="TH Sarabun New" w:cs="TH Sarabun New" w:eastAsia="TH Sarabun New"/>
-          <w:b w:val="0"/>
-          <w:i w:val="0"/>
+          <w:rFonts w:ascii="TH Sarabun New" w:eastAsia="TH Sarabun New" w:hAnsi="TH Sarabun New" w:cs="TH Sarabun New"/>
           <w:sz w:val="32"/>
         </w:rPr>
         <w:t>เมื่อตัวละครตาย ระบบจะสร้างเม็ดเลือดพิกเซลเรโทรจำนวนมากพุ่งกระจายตามแรงระเบิดแบบสุ่ม โดยเม็ดเลือดจะใช้ระบบ Raycast สแกนพื้นผิว และตกลงไปแปะติดแน่นบนแพลตฟอร์มหรือขยับตามแพลตฟอร์มที่เคลื่อนที่ได้อย่างสมจริง</w:t>
@@ -1725,36 +1686,53 @@
     <w:p>
       <w:pPr>
         <w:spacing w:before="200" w:after="80" w:line="276" w:lineRule="auto"/>
-      </w:pPr>
-      <w:r>
-        <w:rPr>
-          <w:rFonts w:ascii="TH Sarabun New" w:hAnsi="TH Sarabun New" w:cs="TH Sarabun New" w:eastAsia="TH Sarabun New"/>
-          <w:b/>
-          <w:i w:val="0"/>
-          <w:sz w:val="32"/>
-        </w:rPr>
-        <w:t>ระบบตรวจสอบฮิตบ็อกซ์แบบเรียลไทม์ (Hazard Debug Hitbox Viewer):</w:t>
-      </w:r>
-    </w:p>
-    <w:p>
-      <w:pPr>
-        <w:spacing w:before="0" w:after="120" w:line="276" w:lineRule="auto"/>
+        <w:rPr>
+          <w:rFonts w:ascii="TH Sarabun New" w:eastAsia="TH Sarabun New" w:hAnsi="TH Sarabun New" w:cs="TH Sarabun New"/>
+          <w:b/>
+          <w:sz w:val="32"/>
+        </w:rPr>
+      </w:pPr>
+    </w:p>
+    <w:p>
+      <w:pPr>
+        <w:spacing w:before="200" w:after="80" w:line="276" w:lineRule="auto"/>
+      </w:pPr>
+      <w:proofErr w:type="spellStart"/>
+      <w:r>
+        <w:rPr>
+          <w:rFonts w:ascii="TH Sarabun New" w:eastAsia="TH Sarabun New" w:hAnsi="TH Sarabun New" w:cs="TH Sarabun New"/>
+          <w:b/>
+          <w:sz w:val="32"/>
+        </w:rPr>
+        <w:lastRenderedPageBreak/>
+        <w:t>ระบบตรวจสอบฮิตบ็อกซ์แบบเรียลไทม์</w:t>
+      </w:r>
+      <w:proofErr w:type="spellEnd"/>
+      <w:r>
+        <w:rPr>
+          <w:rFonts w:ascii="TH Sarabun New" w:eastAsia="TH Sarabun New" w:hAnsi="TH Sarabun New" w:cs="TH Sarabun New"/>
+          <w:b/>
+          <w:sz w:val="32"/>
+        </w:rPr>
+        <w:t xml:space="preserve"> (Hazard Debug Hitbox Viewer):</w:t>
+      </w:r>
+    </w:p>
+    <w:p>
+      <w:pPr>
+        <w:spacing w:after="120" w:line="276" w:lineRule="auto"/>
         <w:ind w:left="360"/>
       </w:pPr>
       <w:r>
         <w:rPr>
-          <w:rFonts w:ascii="TH Sarabun New" w:hAnsi="TH Sarabun New" w:cs="TH Sarabun New" w:eastAsia="TH Sarabun New"/>
-          <w:b/>
-          <w:i w:val="0"/>
+          <w:rFonts w:ascii="TH Sarabun New" w:eastAsia="TH Sarabun New" w:hAnsi="TH Sarabun New" w:cs="TH Sarabun New"/>
+          <w:b/>
           <w:sz w:val="32"/>
         </w:rPr>
         <w:t xml:space="preserve">• Visual Debugging: </w:t>
       </w:r>
       <w:r>
         <w:rPr>
-          <w:rFonts w:ascii="TH Sarabun New" w:hAnsi="TH Sarabun New" w:cs="TH Sarabun New" w:eastAsia="TH Sarabun New"/>
-          <w:b w:val="0"/>
-          <w:i w:val="0"/>
+          <w:rFonts w:ascii="TH Sarabun New" w:eastAsia="TH Sarabun New" w:hAnsi="TH Sarabun New" w:cs="TH Sarabun New"/>
           <w:sz w:val="32"/>
         </w:rPr>
         <w:t>ผู้พัฒนาและผู้เล่นสามารถกดปุ่ม H บนคีย์บอร์ด หรือแตะไอคอนรูปตาบนแถบ HUD ด้านบน เพื่อเปิด/ปิดโหมด Debug Hitbox โดยระบบจะวาดโครงร่างเรขาคณิต (สามเหลี่ยมสีเขียวนีออนสำหรับหนาม, วงกลมสำหรับผลไม้, และกล่องสี่เหลี่ยมสีฟ้าสว่างสำหรับ Trigger Zone) ทับบนหน้าจอแบบเรียลไทม์ ช่วยให้เห็นตำแหน่งที่แท้จริงของกับดักที่ซ่อนอยู่</w:t>
@@ -1766,9 +1744,8 @@
       </w:pPr>
       <w:r>
         <w:rPr>
-          <w:rFonts w:ascii="TH Sarabun New" w:hAnsi="TH Sarabun New" w:cs="TH Sarabun New" w:eastAsia="TH Sarabun New"/>
-          <w:b/>
-          <w:i w:val="0"/>
+          <w:rFonts w:ascii="TH Sarabun New" w:eastAsia="TH Sarabun New" w:hAnsi="TH Sarabun New" w:cs="TH Sarabun New"/>
+          <w:b/>
           <w:sz w:val="32"/>
         </w:rPr>
         <w:t>การรองรับข้ามแพลตฟอร์ม (Cross-Platform Controls):</w:t>
@@ -1776,23 +1753,20 @@
     </w:p>
     <w:p>
       <w:pPr>
-        <w:spacing w:before="0" w:after="120" w:line="276" w:lineRule="auto"/>
+        <w:spacing w:after="120" w:line="276" w:lineRule="auto"/>
         <w:ind w:left="360"/>
       </w:pPr>
       <w:r>
         <w:rPr>
-          <w:rFonts w:ascii="TH Sarabun New" w:hAnsi="TH Sarabun New" w:cs="TH Sarabun New" w:eastAsia="TH Sarabun New"/>
-          <w:b/>
-          <w:i w:val="0"/>
+          <w:rFonts w:ascii="TH Sarabun New" w:eastAsia="TH Sarabun New" w:hAnsi="TH Sarabun New" w:cs="TH Sarabun New"/>
+          <w:b/>
           <w:sz w:val="32"/>
         </w:rPr>
         <w:t xml:space="preserve">• Cross-Platform Support: </w:t>
       </w:r>
       <w:r>
         <w:rPr>
-          <w:rFonts w:ascii="TH Sarabun New" w:hAnsi="TH Sarabun New" w:cs="TH Sarabun New" w:eastAsia="TH Sarabun New"/>
-          <w:b w:val="0"/>
-          <w:i w:val="0"/>
+          <w:rFonts w:ascii="TH Sarabun New" w:eastAsia="TH Sarabun New" w:hAnsi="TH Sarabun New" w:cs="TH Sarabun New"/>
           <w:sz w:val="32"/>
         </w:rPr>
         <w:t>รองรับการเล่นบน PC และ Web ผ่านปุ่มคีย์บอร์ดมาตรฐาน (A, D, Space, Shift, W, R, H) และรองรับการเล่นบน Mobile (สมาร์ตโฟน) ผ่านปุ่มจำลองบนหน้าจอสัมผัส (Virtual D-Pad, ปุ่ม JUMP, ปุ่ม R เกิดใหม่ทันที) พร้อมระบบป้องกันอินพุตค้างเมื่อตัวละครเกิดใหม่</w:t>
@@ -1804,9 +1778,8 @@
       </w:pPr>
       <w:r>
         <w:rPr>
-          <w:rFonts w:ascii="TH Sarabun New" w:hAnsi="TH Sarabun New" w:cs="TH Sarabun New" w:eastAsia="TH Sarabun New"/>
-          <w:b/>
-          <w:i w:val="0"/>
+          <w:rFonts w:ascii="TH Sarabun New" w:eastAsia="TH Sarabun New" w:hAnsi="TH Sarabun New" w:cs="TH Sarabun New"/>
+          <w:b/>
           <w:sz w:val="36"/>
         </w:rPr>
         <w:t>ภาพประกอบ (Screenshots &amp; Showcase)</w:t>
@@ -1814,13 +1787,11 @@
     </w:p>
     <w:p>
       <w:pPr>
-        <w:spacing w:before="0" w:after="120" w:line="276" w:lineRule="auto"/>
-      </w:pPr>
-      <w:r>
-        <w:rPr>
-          <w:rFonts w:ascii="TH Sarabun New" w:hAnsi="TH Sarabun New" w:cs="TH Sarabun New" w:eastAsia="TH Sarabun New"/>
-          <w:b w:val="0"/>
-          <w:i w:val="0"/>
+        <w:spacing w:after="120" w:line="276" w:lineRule="auto"/>
+      </w:pPr>
+      <w:r>
+        <w:rPr>
+          <w:rFonts w:ascii="TH Sarabun New" w:eastAsia="TH Sarabun New" w:hAnsi="TH Sarabun New" w:cs="TH Sarabun New"/>
           <w:sz w:val="32"/>
         </w:rPr>
         <w:t>ภาพถ่ายหน้าจอแสดงผลการทำงานจริงของเกม AUGUSTUS BRUTAL ครอบคลุมทั้งหน้าจอเมนูหลัก, หน้าต่างแนะนำวิธีเล่น, หน้าจอข้อมูลผู้จัดทำ และการเผชิญหน้ากับกับดักในแต่ละด่าน:</w:t>
@@ -1832,9 +1803,8 @@
       </w:pPr>
       <w:r>
         <w:rPr>
-          <w:rFonts w:ascii="TH Sarabun New" w:hAnsi="TH Sarabun New" w:cs="TH Sarabun New" w:eastAsia="TH Sarabun New"/>
-          <w:b/>
-          <w:i w:val="0"/>
+          <w:rFonts w:ascii="TH Sarabun New" w:eastAsia="TH Sarabun New" w:hAnsi="TH Sarabun New" w:cs="TH Sarabun New"/>
+          <w:b/>
           <w:sz w:val="32"/>
         </w:rPr>
         <w:t>ภาพที่ 1: หน้าจอเมนูหลัก (Main Menu Screen)</w:t>
@@ -1846,18 +1816,169 @@
         <w:jc w:val="center"/>
       </w:pPr>
       <w:r>
+        <w:rPr>
+          <w:noProof/>
+        </w:rPr>
         <w:drawing>
-          <wp:inline xmlns:a="http://schemas.openxmlformats.org/drawingml/2006/main" xmlns:pic="http://schemas.openxmlformats.org/drawingml/2006/picture">
+          <wp:inline distT="0" distB="0" distL="0" distR="0" wp14:anchorId="770B132C" wp14:editId="7EEB7930">
             <wp:extent cx="5029200" cy="2827778"/>
+            <wp:effectExtent l="0" t="0" r="0" b="0"/>
             <wp:docPr id="1" name="Picture 1"/>
             <wp:cNvGraphicFramePr>
-              <a:graphicFrameLocks noChangeAspect="1"/>
+              <a:graphicFrameLocks xmlns:a="http://schemas.openxmlformats.org/drawingml/2006/main" noChangeAspect="1"/>
             </wp:cNvGraphicFramePr>
-            <a:graphic>
+            <a:graphic xmlns:a="http://schemas.openxmlformats.org/drawingml/2006/main">
               <a:graphicData uri="http://schemas.openxmlformats.org/drawingml/2006/picture">
-                <pic:pic>
+                <pic:pic xmlns:pic="http://schemas.openxmlformats.org/drawingml/2006/picture">
                   <pic:nvPicPr>
                     <pic:cNvPr id="0" name="MainMenuScreen.png"/>
+                    <pic:cNvPicPr/>
+                  </pic:nvPicPr>
+                  <pic:blipFill>
+                    <a:blip r:embed="rId6"/>
+                    <a:stretch>
+                      <a:fillRect/>
+                    </a:stretch>
+                  </pic:blipFill>
+                  <pic:spPr>
+                    <a:xfrm>
+                      <a:off x="0" y="0"/>
+                      <a:ext cx="5029200" cy="2827778"/>
+                    </a:xfrm>
+                    <a:prstGeom prst="rect">
+                      <a:avLst/>
+                    </a:prstGeom>
+                  </pic:spPr>
+                </pic:pic>
+              </a:graphicData>
+            </a:graphic>
+          </wp:inline>
+        </w:drawing>
+      </w:r>
+    </w:p>
+    <w:p>
+      <w:pPr>
+        <w:spacing w:before="40" w:after="280"/>
+        <w:jc w:val="center"/>
+      </w:pPr>
+      <w:r>
+        <w:rPr>
+          <w:rFonts w:ascii="TH Sarabun New" w:eastAsia="TH Sarabun New" w:hAnsi="TH Sarabun New" w:cs="TH Sarabun New"/>
+          <w:i/>
+          <w:sz w:val="28"/>
+        </w:rPr>
+        <w:t>คำอธิบาย: แสดงชื่อเกม "AUGUSTUS BRUTAL" สไตล์เรโทรพิกเซลแบบ Flat คมชัด พร้อมปุ่มตัวเลือก START GAME, SELECT STAGE, HOW TO PLAY, และ ABOUT / ผู้จัดทำ</w:t>
+      </w:r>
+    </w:p>
+    <w:p>
+      <w:pPr>
+        <w:spacing w:before="200" w:after="80" w:line="276" w:lineRule="auto"/>
+      </w:pPr>
+      <w:r>
+        <w:rPr>
+          <w:rFonts w:ascii="TH Sarabun New" w:eastAsia="TH Sarabun New" w:hAnsi="TH Sarabun New" w:cs="TH Sarabun New"/>
+          <w:b/>
+          <w:sz w:val="32"/>
+        </w:rPr>
+        <w:lastRenderedPageBreak/>
+        <w:t>ภาพที่ 2: หน้าต่างวิธีเล่น (How to Play Screen)</w:t>
+      </w:r>
+    </w:p>
+    <w:p>
+      <w:pPr>
+        <w:spacing w:before="120" w:after="80"/>
+        <w:jc w:val="center"/>
+      </w:pPr>
+      <w:r>
+        <w:rPr>
+          <w:noProof/>
+        </w:rPr>
+        <w:drawing>
+          <wp:inline distT="0" distB="0" distL="0" distR="0" wp14:anchorId="2A953088" wp14:editId="3873A241">
+            <wp:extent cx="5029200" cy="2827778"/>
+            <wp:effectExtent l="0" t="0" r="0" b="0"/>
+            <wp:docPr id="2" name="Picture 2"/>
+            <wp:cNvGraphicFramePr>
+              <a:graphicFrameLocks xmlns:a="http://schemas.openxmlformats.org/drawingml/2006/main" noChangeAspect="1"/>
+            </wp:cNvGraphicFramePr>
+            <a:graphic xmlns:a="http://schemas.openxmlformats.org/drawingml/2006/main">
+              <a:graphicData uri="http://schemas.openxmlformats.org/drawingml/2006/picture">
+                <pic:pic xmlns:pic="http://schemas.openxmlformats.org/drawingml/2006/picture">
+                  <pic:nvPicPr>
+                    <pic:cNvPr id="0" name="HowToPlay.png"/>
+                    <pic:cNvPicPr/>
+                  </pic:nvPicPr>
+                  <pic:blipFill>
+                    <a:blip r:embed="rId7"/>
+                    <a:stretch>
+                      <a:fillRect/>
+                    </a:stretch>
+                  </pic:blipFill>
+                  <pic:spPr>
+                    <a:xfrm>
+                      <a:off x="0" y="0"/>
+                      <a:ext cx="5029200" cy="2827778"/>
+                    </a:xfrm>
+                    <a:prstGeom prst="rect">
+                      <a:avLst/>
+                    </a:prstGeom>
+                  </pic:spPr>
+                </pic:pic>
+              </a:graphicData>
+            </a:graphic>
+          </wp:inline>
+        </w:drawing>
+      </w:r>
+    </w:p>
+    <w:p>
+      <w:pPr>
+        <w:spacing w:before="40" w:after="280"/>
+        <w:jc w:val="center"/>
+      </w:pPr>
+      <w:r>
+        <w:rPr>
+          <w:rFonts w:ascii="TH Sarabun New" w:eastAsia="TH Sarabun New" w:hAnsi="TH Sarabun New" w:cs="TH Sarabun New"/>
+          <w:i/>
+          <w:sz w:val="28"/>
+        </w:rPr>
+        <w:t>คำอธิบาย: แสดงคำแนะนำการควบคุมทั้ง Keyboard สำหรับ PC/Web (A/D, Space/Shift, R, H) และระบบ Virtual Controls สำหรับหน้าจอสัมผัสบน Mobile พร้อมคำแนะนำปรัชญาการเล่นสไตล์ Masocore</w:t>
+      </w:r>
+    </w:p>
+    <w:p>
+      <w:pPr>
+        <w:spacing w:before="200" w:after="80" w:line="276" w:lineRule="auto"/>
+      </w:pPr>
+      <w:r>
+        <w:rPr>
+          <w:rFonts w:ascii="TH Sarabun New" w:eastAsia="TH Sarabun New" w:hAnsi="TH Sarabun New" w:cs="TH Sarabun New"/>
+          <w:b/>
+          <w:sz w:val="32"/>
+        </w:rPr>
+        <w:t>ภาพที่ 3: หน้าจอข้อมูลผู้จัดทำ (About Screen)</w:t>
+      </w:r>
+    </w:p>
+    <w:p>
+      <w:pPr>
+        <w:spacing w:before="120" w:after="80"/>
+        <w:jc w:val="center"/>
+      </w:pPr>
+      <w:r>
+        <w:rPr>
+          <w:noProof/>
+        </w:rPr>
+        <w:drawing>
+          <wp:inline distT="0" distB="0" distL="0" distR="0" wp14:anchorId="47247114" wp14:editId="5C12E175">
+            <wp:extent cx="5029200" cy="2832206"/>
+            <wp:effectExtent l="0" t="0" r="0" b="0"/>
+            <wp:docPr id="3" name="Picture 3"/>
+            <wp:cNvGraphicFramePr>
+              <a:graphicFrameLocks xmlns:a="http://schemas.openxmlformats.org/drawingml/2006/main" noChangeAspect="1"/>
+            </wp:cNvGraphicFramePr>
+            <a:graphic xmlns:a="http://schemas.openxmlformats.org/drawingml/2006/main">
+              <a:graphicData uri="http://schemas.openxmlformats.org/drawingml/2006/picture">
+                <pic:pic xmlns:pic="http://schemas.openxmlformats.org/drawingml/2006/picture">
+                  <pic:nvPicPr>
+                    <pic:cNvPr id="0" name="About.png"/>
                     <pic:cNvPicPr/>
                   </pic:nvPicPr>
                   <pic:blipFill>
@@ -1869,9 +1990,11 @@
                   <pic:spPr>
                     <a:xfrm>
                       <a:off x="0" y="0"/>
-                      <a:ext cx="5029200" cy="2827778"/>
+                      <a:ext cx="5029200" cy="2832206"/>
                     </a:xfrm>
-                    <a:prstGeom prst="rect"/>
+                    <a:prstGeom prst="rect">
+                      <a:avLst/>
+                    </a:prstGeom>
                   </pic:spPr>
                 </pic:pic>
               </a:graphicData>
@@ -1887,26 +2010,63 @@
       </w:pPr>
       <w:r>
         <w:rPr>
-          <w:rFonts w:ascii="TH Sarabun New" w:hAnsi="TH Sarabun New" w:cs="TH Sarabun New" w:eastAsia="TH Sarabun New"/>
-          <w:b w:val="0"/>
+          <w:rFonts w:ascii="TH Sarabun New" w:eastAsia="TH Sarabun New" w:hAnsi="TH Sarabun New" w:cs="TH Sarabun New"/>
           <w:i/>
           <w:sz w:val="28"/>
         </w:rPr>
-        <w:t>คำอธิบาย: แสดงชื่อเกม "AUGUSTUS BRUTAL" สไตล์เรโทรพิกเซลแบบ Flat คมชัด พร้อมปุ่มตัวเลือก START GAME, SELECT STAGE, HOW TO PLAY, และ ABOUT / ผู้จัดทำ</w:t>
+        <w:t>คำอธิบาย: แสดงข้อมูลรายวิชา สาขาวิชา คณะ สถาบัน อาจารย์ผู้สอน และรายชื่อสมาชิกกลุ่ม Developer Team (นายชัชชัย นาคแท้ และ นายปุณยกร ธรรมวงษ์) พร้อมปุ่มย้อนกลับลูกศรชี้ซ้าย</w:t>
       </w:r>
     </w:p>
     <w:p>
       <w:pPr>
         <w:spacing w:before="200" w:after="80" w:line="276" w:lineRule="auto"/>
-      </w:pPr>
-      <w:r>
-        <w:rPr>
-          <w:rFonts w:ascii="TH Sarabun New" w:hAnsi="TH Sarabun New" w:cs="TH Sarabun New" w:eastAsia="TH Sarabun New"/>
-          <w:b/>
-          <w:i w:val="0"/>
-          <w:sz w:val="32"/>
-        </w:rPr>
-        <w:t>ภาพที่ 2: หน้าต่างวิธีเล่น (How to Play Screen)</w:t>
+        <w:rPr>
+          <w:rFonts w:ascii="TH Sarabun New" w:eastAsia="TH Sarabun New" w:hAnsi="TH Sarabun New" w:cs="TH Sarabun New"/>
+          <w:b/>
+          <w:sz w:val="32"/>
+        </w:rPr>
+      </w:pPr>
+    </w:p>
+    <w:p>
+      <w:pPr>
+        <w:spacing w:before="200" w:after="80" w:line="276" w:lineRule="auto"/>
+      </w:pPr>
+      <w:proofErr w:type="spellStart"/>
+      <w:r>
+        <w:rPr>
+          <w:rFonts w:ascii="TH Sarabun New" w:eastAsia="TH Sarabun New" w:hAnsi="TH Sarabun New" w:cs="TH Sarabun New"/>
+          <w:b/>
+          <w:sz w:val="32"/>
+        </w:rPr>
+        <w:lastRenderedPageBreak/>
+        <w:t>ภาพที่</w:t>
+      </w:r>
+      <w:proofErr w:type="spellEnd"/>
+      <w:r>
+        <w:rPr>
+          <w:rFonts w:ascii="TH Sarabun New" w:eastAsia="TH Sarabun New" w:hAnsi="TH Sarabun New" w:cs="TH Sarabun New"/>
+          <w:b/>
+          <w:sz w:val="32"/>
+        </w:rPr>
+        <w:t xml:space="preserve"> 4: </w:t>
+      </w:r>
+      <w:proofErr w:type="spellStart"/>
+      <w:r>
+        <w:rPr>
+          <w:rFonts w:ascii="TH Sarabun New" w:eastAsia="TH Sarabun New" w:hAnsi="TH Sarabun New" w:cs="TH Sarabun New"/>
+          <w:b/>
+          <w:sz w:val="32"/>
+        </w:rPr>
+        <w:t>ด่านที่</w:t>
+      </w:r>
+      <w:proofErr w:type="spellEnd"/>
+      <w:r>
+        <w:rPr>
+          <w:rFonts w:ascii="TH Sarabun New" w:eastAsia="TH Sarabun New" w:hAnsi="TH Sarabun New" w:cs="TH Sarabun New"/>
+          <w:b/>
+          <w:sz w:val="32"/>
+        </w:rPr>
+        <w:t xml:space="preserve"> 1 - สวนผลไม้ลวงตา (Stage 1: Orchard of Deception)</w:t>
       </w:r>
     </w:p>
     <w:p>
@@ -1915,18 +2075,22 @@
         <w:jc w:val="center"/>
       </w:pPr>
       <w:r>
+        <w:rPr>
+          <w:noProof/>
+        </w:rPr>
         <w:drawing>
-          <wp:inline xmlns:a="http://schemas.openxmlformats.org/drawingml/2006/main" xmlns:pic="http://schemas.openxmlformats.org/drawingml/2006/picture">
+          <wp:inline distT="0" distB="0" distL="0" distR="0" wp14:anchorId="5B60337F" wp14:editId="14A481DB">
             <wp:extent cx="5029200" cy="2827778"/>
-            <wp:docPr id="2" name="Picture 2"/>
+            <wp:effectExtent l="0" t="0" r="0" b="0"/>
+            <wp:docPr id="4" name="Picture 4"/>
             <wp:cNvGraphicFramePr>
-              <a:graphicFrameLocks noChangeAspect="1"/>
+              <a:graphicFrameLocks xmlns:a="http://schemas.openxmlformats.org/drawingml/2006/main" noChangeAspect="1"/>
             </wp:cNvGraphicFramePr>
-            <a:graphic>
+            <a:graphic xmlns:a="http://schemas.openxmlformats.org/drawingml/2006/main">
               <a:graphicData uri="http://schemas.openxmlformats.org/drawingml/2006/picture">
-                <pic:pic>
+                <pic:pic xmlns:pic="http://schemas.openxmlformats.org/drawingml/2006/picture">
                   <pic:nvPicPr>
-                    <pic:cNvPr id="0" name="HowToPlay.png"/>
+                    <pic:cNvPr id="0" name="Stage1.png"/>
                     <pic:cNvPicPr/>
                   </pic:nvPicPr>
                   <pic:blipFill>
@@ -1940,7 +2104,9 @@
                       <a:off x="0" y="0"/>
                       <a:ext cx="5029200" cy="2827778"/>
                     </a:xfrm>
-                    <a:prstGeom prst="rect"/>
+                    <a:prstGeom prst="rect">
+                      <a:avLst/>
+                    </a:prstGeom>
                   </pic:spPr>
                 </pic:pic>
               </a:graphicData>
@@ -1956,12 +2122,11 @@
       </w:pPr>
       <w:r>
         <w:rPr>
-          <w:rFonts w:ascii="TH Sarabun New" w:hAnsi="TH Sarabun New" w:cs="TH Sarabun New" w:eastAsia="TH Sarabun New"/>
-          <w:b w:val="0"/>
+          <w:rFonts w:ascii="TH Sarabun New" w:eastAsia="TH Sarabun New" w:hAnsi="TH Sarabun New" w:cs="TH Sarabun New"/>
           <w:i/>
           <w:sz w:val="28"/>
         </w:rPr>
-        <w:t>คำอธิบาย: แสดงคำแนะนำการควบคุมทั้ง Keyboard สำหรับ PC/Web (A/D, Space/Shift, R, H) และระบบ Virtual Controls สำหรับหน้าจอสัมผัสบน Mobile พร้อมคำแนะนำปรัชญาการเล่นสไตล์ Masocore</w:t>
+        <w:t>คำอธิบาย: แสดงสภาพแวดล้อมด่านที่ 1 กับดักแอปเปิ้ลพุ่งสวนแรงโน้มถ่วง, หนามสไลด์บนแท่นหิน, และระบบแถบ HUD ด้านบนพร้อมปุ่มเปิด/ปิด Debug Hitbox และ Virtual Controls</w:t>
       </w:r>
     </w:p>
     <w:p>
@@ -1970,12 +2135,11 @@
       </w:pPr>
       <w:r>
         <w:rPr>
-          <w:rFonts w:ascii="TH Sarabun New" w:hAnsi="TH Sarabun New" w:cs="TH Sarabun New" w:eastAsia="TH Sarabun New"/>
-          <w:b/>
-          <w:i w:val="0"/>
-          <w:sz w:val="32"/>
-        </w:rPr>
-        <w:t>ภาพที่ 3: หน้าจอข้อมูลผู้จัดทำ (About Screen)</w:t>
+          <w:rFonts w:ascii="TH Sarabun New" w:eastAsia="TH Sarabun New" w:hAnsi="TH Sarabun New" w:cs="TH Sarabun New"/>
+          <w:b/>
+          <w:sz w:val="32"/>
+        </w:rPr>
+        <w:t>ภาพที่ 5: ด่านที่ 2 - เขาวงกตหนามบิน (Stage 2: Spike Maze)</w:t>
       </w:r>
     </w:p>
     <w:p>
@@ -1984,18 +2148,22 @@
         <w:jc w:val="center"/>
       </w:pPr>
       <w:r>
+        <w:rPr>
+          <w:noProof/>
+        </w:rPr>
         <w:drawing>
-          <wp:inline xmlns:a="http://schemas.openxmlformats.org/drawingml/2006/main" xmlns:pic="http://schemas.openxmlformats.org/drawingml/2006/picture">
-            <wp:extent cx="5029200" cy="2832206"/>
-            <wp:docPr id="3" name="Picture 3"/>
+          <wp:inline distT="0" distB="0" distL="0" distR="0" wp14:anchorId="0616658F" wp14:editId="2442DEDD">
+            <wp:extent cx="5029200" cy="2827778"/>
+            <wp:effectExtent l="0" t="0" r="0" b="0"/>
+            <wp:docPr id="5" name="Picture 5"/>
             <wp:cNvGraphicFramePr>
-              <a:graphicFrameLocks noChangeAspect="1"/>
+              <a:graphicFrameLocks xmlns:a="http://schemas.openxmlformats.org/drawingml/2006/main" noChangeAspect="1"/>
             </wp:cNvGraphicFramePr>
-            <a:graphic>
+            <a:graphic xmlns:a="http://schemas.openxmlformats.org/drawingml/2006/main">
               <a:graphicData uri="http://schemas.openxmlformats.org/drawingml/2006/picture">
-                <pic:pic>
+                <pic:pic xmlns:pic="http://schemas.openxmlformats.org/drawingml/2006/picture">
                   <pic:nvPicPr>
-                    <pic:cNvPr id="0" name="About.png"/>
+                    <pic:cNvPr id="0" name="Stage2.png"/>
                     <pic:cNvPicPr/>
                   </pic:nvPicPr>
                   <pic:blipFill>
@@ -2007,9 +2175,11 @@
                   <pic:spPr>
                     <a:xfrm>
                       <a:off x="0" y="0"/>
-                      <a:ext cx="5029200" cy="2832206"/>
+                      <a:ext cx="5029200" cy="2827778"/>
                     </a:xfrm>
-                    <a:prstGeom prst="rect"/>
+                    <a:prstGeom prst="rect">
+                      <a:avLst/>
+                    </a:prstGeom>
                   </pic:spPr>
                 </pic:pic>
               </a:graphicData>
@@ -2025,26 +2195,63 @@
       </w:pPr>
       <w:r>
         <w:rPr>
-          <w:rFonts w:ascii="TH Sarabun New" w:hAnsi="TH Sarabun New" w:cs="TH Sarabun New" w:eastAsia="TH Sarabun New"/>
-          <w:b w:val="0"/>
+          <w:rFonts w:ascii="TH Sarabun New" w:eastAsia="TH Sarabun New" w:hAnsi="TH Sarabun New" w:cs="TH Sarabun New"/>
           <w:i/>
           <w:sz w:val="28"/>
         </w:rPr>
-        <w:t>คำอธิบาย: แสดงข้อมูลรายวิชา สาขาวิชา คณะ สถาบัน อาจารย์ผู้สอน และรายชื่อสมาชิกกลุ่ม Developer Team (นายชัชชัย นาคแท้ และ นายปุณยกร ธรรมวงษ์) พร้อมปุ่มย้อนกลับลูกศรชี้ซ้าย</w:t>
+        <w:t>คำอธิบาย: แสดงความท้าทายของด่านที่ 2 กับดักหนามพุ่งทะลุฉากด้วยความเร็วสูง (Rushers) และการควบคุมจังหวะการกระโดด Double Jump หลบหนามกลางอากาศในช่องทางแคบ</w:t>
       </w:r>
     </w:p>
     <w:p>
       <w:pPr>
         <w:spacing w:before="200" w:after="80" w:line="276" w:lineRule="auto"/>
-      </w:pPr>
-      <w:r>
-        <w:rPr>
-          <w:rFonts w:ascii="TH Sarabun New" w:hAnsi="TH Sarabun New" w:cs="TH Sarabun New" w:eastAsia="TH Sarabun New"/>
-          <w:b/>
-          <w:i w:val="0"/>
-          <w:sz w:val="32"/>
-        </w:rPr>
-        <w:t>ภาพที่ 4: ด่านที่ 1 - สวนผลไม้ลวงตา (Stage 1: Orchard of Deception)</w:t>
+        <w:rPr>
+          <w:rFonts w:ascii="TH Sarabun New" w:eastAsia="TH Sarabun New" w:hAnsi="TH Sarabun New" w:cs="TH Sarabun New"/>
+          <w:b/>
+          <w:sz w:val="32"/>
+        </w:rPr>
+      </w:pPr>
+    </w:p>
+    <w:p>
+      <w:pPr>
+        <w:spacing w:before="200" w:after="80" w:line="276" w:lineRule="auto"/>
+      </w:pPr>
+      <w:proofErr w:type="spellStart"/>
+      <w:r>
+        <w:rPr>
+          <w:rFonts w:ascii="TH Sarabun New" w:eastAsia="TH Sarabun New" w:hAnsi="TH Sarabun New" w:cs="TH Sarabun New"/>
+          <w:b/>
+          <w:sz w:val="32"/>
+        </w:rPr>
+        <w:lastRenderedPageBreak/>
+        <w:t>ภาพที่</w:t>
+      </w:r>
+      <w:proofErr w:type="spellEnd"/>
+      <w:r>
+        <w:rPr>
+          <w:rFonts w:ascii="TH Sarabun New" w:eastAsia="TH Sarabun New" w:hAnsi="TH Sarabun New" w:cs="TH Sarabun New"/>
+          <w:b/>
+          <w:sz w:val="32"/>
+        </w:rPr>
+        <w:t xml:space="preserve"> 6: </w:t>
+      </w:r>
+      <w:proofErr w:type="spellStart"/>
+      <w:r>
+        <w:rPr>
+          <w:rFonts w:ascii="TH Sarabun New" w:eastAsia="TH Sarabun New" w:hAnsi="TH Sarabun New" w:cs="TH Sarabun New"/>
+          <w:b/>
+          <w:sz w:val="32"/>
+        </w:rPr>
+        <w:t>ด่านที่</w:t>
+      </w:r>
+      <w:proofErr w:type="spellEnd"/>
+      <w:r>
+        <w:rPr>
+          <w:rFonts w:ascii="TH Sarabun New" w:eastAsia="TH Sarabun New" w:hAnsi="TH Sarabun New" w:cs="TH Sarabun New"/>
+          <w:b/>
+          <w:sz w:val="32"/>
+        </w:rPr>
+        <w:t xml:space="preserve"> 3 - กระโดดวัดใจและป้อมปืนกล (Stage 3: Leap of Faith &amp; Turret Arena)</w:t>
       </w:r>
     </w:p>
     <w:p>
@@ -2053,18 +2260,22 @@
         <w:jc w:val="center"/>
       </w:pPr>
       <w:r>
+        <w:rPr>
+          <w:noProof/>
+        </w:rPr>
         <w:drawing>
-          <wp:inline xmlns:a="http://schemas.openxmlformats.org/drawingml/2006/main" xmlns:pic="http://schemas.openxmlformats.org/drawingml/2006/picture">
+          <wp:inline distT="0" distB="0" distL="0" distR="0" wp14:anchorId="346C9BCD" wp14:editId="45A1E74E">
             <wp:extent cx="5029200" cy="2827778"/>
-            <wp:docPr id="4" name="Picture 4"/>
+            <wp:effectExtent l="0" t="0" r="0" b="0"/>
+            <wp:docPr id="6" name="Picture 6"/>
             <wp:cNvGraphicFramePr>
-              <a:graphicFrameLocks noChangeAspect="1"/>
+              <a:graphicFrameLocks xmlns:a="http://schemas.openxmlformats.org/drawingml/2006/main" noChangeAspect="1"/>
             </wp:cNvGraphicFramePr>
-            <a:graphic>
+            <a:graphic xmlns:a="http://schemas.openxmlformats.org/drawingml/2006/main">
               <a:graphicData uri="http://schemas.openxmlformats.org/drawingml/2006/picture">
-                <pic:pic>
+                <pic:pic xmlns:pic="http://schemas.openxmlformats.org/drawingml/2006/picture">
                   <pic:nvPicPr>
-                    <pic:cNvPr id="0" name="Stage1.png"/>
+                    <pic:cNvPr id="0" name="Stage3.png"/>
                     <pic:cNvPicPr/>
                   </pic:nvPicPr>
                   <pic:blipFill>
@@ -2078,7 +2289,9 @@
                       <a:off x="0" y="0"/>
                       <a:ext cx="5029200" cy="2827778"/>
                     </a:xfrm>
-                    <a:prstGeom prst="rect"/>
+                    <a:prstGeom prst="rect">
+                      <a:avLst/>
+                    </a:prstGeom>
                   </pic:spPr>
                 </pic:pic>
               </a:graphicData>
@@ -2094,12 +2307,441 @@
       </w:pPr>
       <w:r>
         <w:rPr>
-          <w:rFonts w:ascii="TH Sarabun New" w:hAnsi="TH Sarabun New" w:cs="TH Sarabun New" w:eastAsia="TH Sarabun New"/>
-          <w:b w:val="0"/>
+          <w:rFonts w:ascii="TH Sarabun New" w:eastAsia="TH Sarabun New" w:hAnsi="TH Sarabun New" w:cs="TH Sarabun New"/>
           <w:i/>
           <w:sz w:val="28"/>
         </w:rPr>
-        <w:t>คำอธิบาย: แสดงสภาพแวดล้อมด่านที่ 1 กับดักแอปเปิ้ลพุ่งสวนแรงโน้มถ่วง, หนามสไลด์บนแท่นหิน, และระบบแถบ HUD ด้านบนพร้อมปุ่มเปิด/ปิด Debug Hitbox และ Virtual Controls</w:t>
+        <w:t>คำอธิบาย: แสดงระบบป้อมปืนกลกวาดองศาการเล็ง (Turret Hazard), เลเซอร์สไนเปอร์ล็อกเป้า, และการกระโดดวัดใจข้ามเหวลึกผ่านแท่นกระโดดที่ต้องการความแม่นยำระดับพิกเซล</w:t>
+      </w:r>
+    </w:p>
+    <w:p>
+      <w:pPr>
+        <w:spacing w:before="280" w:after="120" w:line="276" w:lineRule="auto"/>
+      </w:pPr>
+      <w:r>
+        <w:rPr>
+          <w:rFonts w:ascii="TH Sarabun New" w:eastAsia="TH Sarabun New" w:hAnsi="TH Sarabun New" w:cs="TH Sarabun New"/>
+          <w:b/>
+          <w:sz w:val="36"/>
+        </w:rPr>
+        <w:t>เครื่องมือที่ใช้ (App Inventor / Flutter)</w:t>
+      </w:r>
+    </w:p>
+    <w:p>
+      <w:pPr>
+        <w:spacing w:after="120" w:line="276" w:lineRule="auto"/>
+      </w:pPr>
+      <w:r>
+        <w:rPr>
+          <w:rFonts w:ascii="TH Sarabun New" w:eastAsia="TH Sarabun New" w:hAnsi="TH Sarabun New" w:cs="TH Sarabun New"/>
+          <w:sz w:val="32"/>
+        </w:rPr>
+        <w:t>โครงงานนี้พัฒนาด้วย Flutter Framework โดยมีรายละเอียดเครื่องมือและเทคโนโลยีที่ใช้ดังนี้:</w:t>
+      </w:r>
+    </w:p>
+    <w:p>
+      <w:pPr>
+        <w:spacing w:after="120" w:line="276" w:lineRule="auto"/>
+        <w:ind w:left="360"/>
+      </w:pPr>
+      <w:r>
+        <w:rPr>
+          <w:rFonts w:ascii="TH Sarabun New" w:eastAsia="TH Sarabun New" w:hAnsi="TH Sarabun New" w:cs="TH Sarabun New"/>
+          <w:b/>
+          <w:sz w:val="32"/>
+        </w:rPr>
+        <w:t xml:space="preserve">• ภาษาที่ใช้พัฒนา: Dart 3.x - </w:t>
+      </w:r>
+      <w:r>
+        <w:rPr>
+          <w:rFonts w:ascii="TH Sarabun New" w:eastAsia="TH Sarabun New" w:hAnsi="TH Sarabun New" w:cs="TH Sarabun New"/>
+          <w:sz w:val="32"/>
+        </w:rPr>
+        <w:t>ภาษาโปรแกรมเชิงวัตถุประเภท Modern Strongly-Typed สำหรับพัฒนาตรรกะเกมและระบบฟิสิกส์</w:t>
+      </w:r>
+    </w:p>
+    <w:p>
+      <w:pPr>
+        <w:spacing w:after="120" w:line="276" w:lineRule="auto"/>
+        <w:ind w:left="360"/>
+      </w:pPr>
+      <w:r>
+        <w:rPr>
+          <w:rFonts w:ascii="TH Sarabun New" w:eastAsia="TH Sarabun New" w:hAnsi="TH Sarabun New" w:cs="TH Sarabun New"/>
+          <w:b/>
+          <w:sz w:val="32"/>
+        </w:rPr>
+        <w:t xml:space="preserve">• เฟรมเวิร์กหลัก: Flutter 3.x - </w:t>
+      </w:r>
+      <w:r>
+        <w:rPr>
+          <w:rFonts w:ascii="TH Sarabun New" w:eastAsia="TH Sarabun New" w:hAnsi="TH Sarabun New" w:cs="TH Sarabun New"/>
+          <w:sz w:val="32"/>
+        </w:rPr>
+        <w:t>เฟรมเวิร์กหลักสำหรับการสร้าง User Interface ข้ามแพลตฟอร์ม (Cross-Platform) รองรับทั้ง Android, iOS, Web และ Windows</w:t>
+      </w:r>
+    </w:p>
+    <w:p>
+      <w:pPr>
+        <w:spacing w:after="120" w:line="276" w:lineRule="auto"/>
+        <w:ind w:left="360"/>
+      </w:pPr>
+      <w:r>
+        <w:rPr>
+          <w:rFonts w:ascii="TH Sarabun New" w:eastAsia="TH Sarabun New" w:hAnsi="TH Sarabun New" w:cs="TH Sarabun New"/>
+          <w:b/>
+          <w:sz w:val="32"/>
+        </w:rPr>
+        <w:t xml:space="preserve">• เกมเอนจิน: Flame Engine (v1.x) - </w:t>
+      </w:r>
+      <w:r>
+        <w:rPr>
+          <w:rFonts w:ascii="TH Sarabun New" w:eastAsia="TH Sarabun New" w:hAnsi="TH Sarabun New" w:cs="TH Sarabun New"/>
+          <w:sz w:val="32"/>
+        </w:rPr>
+        <w:t>เกมเอนจิน 2D ประสิทธิภาพสูงบน Flutter โดยใช้จัดการ Game Loop (Update &amp; Render), ระบบตรวจจับการชน (Collision Detection), และ Canvas API สำหรับการวาดกราฟิกพิกเซล</w:t>
+      </w:r>
+    </w:p>
+    <w:p>
+      <w:pPr>
+        <w:spacing w:after="120" w:line="276" w:lineRule="auto"/>
+        <w:ind w:left="360"/>
+      </w:pPr>
+      <w:r>
+        <w:rPr>
+          <w:rFonts w:ascii="TH Sarabun New" w:eastAsia="TH Sarabun New" w:hAnsi="TH Sarabun New" w:cs="TH Sarabun New"/>
+          <w:b/>
+          <w:sz w:val="32"/>
+        </w:rPr>
+        <w:t xml:space="preserve">• การจัดการเวอร์ชัน (Version Control): Git &amp; GitHub - </w:t>
+      </w:r>
+      <w:r>
+        <w:rPr>
+          <w:rFonts w:ascii="TH Sarabun New" w:eastAsia="TH Sarabun New" w:hAnsi="TH Sarabun New" w:cs="TH Sarabun New"/>
+          <w:sz w:val="32"/>
+        </w:rPr>
+        <w:t>ระบบควบคุมเวอร์ชันซอร์สโค้ด และจัดเก็บบนคลาวด์สำหรับทำงานร่วมกันในทีม</w:t>
+      </w:r>
+    </w:p>
+    <w:p>
+      <w:pPr>
+        <w:spacing w:after="120" w:line="276" w:lineRule="auto"/>
+        <w:ind w:left="360"/>
+      </w:pPr>
+      <w:r>
+        <w:rPr>
+          <w:rFonts w:ascii="TH Sarabun New" w:eastAsia="TH Sarabun New" w:hAnsi="TH Sarabun New" w:cs="TH Sarabun New"/>
+          <w:b/>
+          <w:sz w:val="32"/>
+        </w:rPr>
+        <w:lastRenderedPageBreak/>
+        <w:t xml:space="preserve">• สภาพแวดล้อมการพัฒนา (IDE): Visual Studio Code / Google Antigravity - </w:t>
+      </w:r>
+      <w:r>
+        <w:rPr>
+          <w:rFonts w:ascii="TH Sarabun New" w:eastAsia="TH Sarabun New" w:hAnsi="TH Sarabun New" w:cs="TH Sarabun New"/>
+          <w:sz w:val="32"/>
+        </w:rPr>
+        <w:t>โปรแกรมแก้ไขโค้ดและสภาพแวดล้อมการพัฒนาแอปพลิเคชัน</w:t>
+      </w:r>
+    </w:p>
+    <w:p>
+      <w:pPr>
+        <w:spacing w:after="120" w:line="276" w:lineRule="auto"/>
+        <w:ind w:left="360"/>
+      </w:pPr>
+      <w:r>
+        <w:rPr>
+          <w:rFonts w:ascii="TH Sarabun New" w:eastAsia="TH Sarabun New" w:hAnsi="TH Sarabun New" w:cs="TH Sarabun New"/>
+          <w:b/>
+          <w:sz w:val="32"/>
+        </w:rPr>
+        <w:t xml:space="preserve">• เครื่องมือทดสอบและตรวจสอบคุณภาพ: flutter test &amp; flutter analyze - </w:t>
+      </w:r>
+      <w:r>
+        <w:rPr>
+          <w:rFonts w:ascii="TH Sarabun New" w:eastAsia="TH Sarabun New" w:hAnsi="TH Sarabun New" w:cs="TH Sarabun New"/>
+          <w:sz w:val="32"/>
+        </w:rPr>
+        <w:t>ใช้คำสั่ง flutter test ในการทำ Automated Unit Testing สำหรับฟิสิกส์และกับดัก และคำสั่ง flutter analyze ในการตรวจสอบคุณภาพและมาตรฐานของโค้ด</w:t>
+      </w:r>
+    </w:p>
+    <w:p>
+      <w:pPr>
+        <w:spacing w:before="280" w:after="120" w:line="276" w:lineRule="auto"/>
+      </w:pPr>
+      <w:r>
+        <w:rPr>
+          <w:rFonts w:ascii="TH Sarabun New" w:eastAsia="TH Sarabun New" w:hAnsi="TH Sarabun New" w:cs="TH Sarabun New"/>
+          <w:b/>
+          <w:sz w:val="36"/>
+        </w:rPr>
+        <w:t>ลิงค์ repo และลิงค์วิดีโอ</w:t>
+      </w:r>
+    </w:p>
+    <w:p>
+      <w:pPr>
+        <w:spacing w:after="120" w:line="276" w:lineRule="auto"/>
+        <w:ind w:left="360"/>
+      </w:pPr>
+      <w:r>
+        <w:rPr>
+          <w:rFonts w:ascii="TH Sarabun New" w:eastAsia="TH Sarabun New" w:hAnsi="TH Sarabun New" w:cs="TH Sarabun New"/>
+          <w:b/>
+          <w:sz w:val="32"/>
+        </w:rPr>
+        <w:t xml:space="preserve">• ลิงก์ GitHub Repository: </w:t>
+      </w:r>
+      <w:hyperlink r:id="rId12" w:history="1">
+        <w:r>
+          <w:rPr>
+            <w:rStyle w:val="Hyperlink"/>
+            <w:rFonts w:ascii="TH Sarabun New" w:eastAsia="TH Sarabun New" w:hAnsi="TH Sarabun New" w:cs="TH Sarabun New"/>
+            <w:sz w:val="32"/>
+          </w:rPr>
+          <w:t>https://github.com/ChatchaiN</w:t>
+        </w:r>
+        <w:r>
+          <w:rPr>
+            <w:rStyle w:val="Hyperlink"/>
+            <w:rFonts w:ascii="TH Sarabun New" w:eastAsia="TH Sarabun New" w:hAnsi="TH Sarabun New" w:cs="TH Sarabun New"/>
+            <w:sz w:val="32"/>
+          </w:rPr>
+          <w:t>a</w:t>
+        </w:r>
+        <w:r>
+          <w:rPr>
+            <w:rStyle w:val="Hyperlink"/>
+            <w:rFonts w:ascii="TH Sarabun New" w:eastAsia="TH Sarabun New" w:hAnsi="TH Sarabun New" w:cs="TH Sarabun New"/>
+            <w:sz w:val="32"/>
+          </w:rPr>
+          <w:t>ktae/Augustus.git</w:t>
+        </w:r>
+      </w:hyperlink>
+    </w:p>
+    <w:p>
+      <w:pPr>
+        <w:spacing w:after="120" w:line="276" w:lineRule="auto"/>
+        <w:ind w:left="360"/>
+      </w:pPr>
+      <w:r>
+        <w:rPr>
+          <w:rFonts w:ascii="TH Sarabun New" w:eastAsia="TH Sarabun New" w:hAnsi="TH Sarabun New" w:cs="TH Sarabun New"/>
+          <w:b/>
+          <w:sz w:val="32"/>
+        </w:rPr>
+        <w:t>• ลิงก์วิดีโอสาธิตการเล่น (Gameplay Video):</w:t>
+      </w:r>
+      <w:r>
+        <w:rPr>
+          <w:rFonts w:ascii="TH Sarabun New" w:eastAsia="TH Sarabun New" w:hAnsi="TH Sarabun New" w:cs="TH Sarabun New"/>
+          <w:b/>
+          <w:sz w:val="32"/>
+        </w:rPr>
+        <w:t xml:space="preserve"> </w:t>
+      </w:r>
+      <w:hyperlink r:id="rId13" w:history="1">
+        <w:r>
+          <w:rPr>
+            <w:rStyle w:val="Hyperlink"/>
+            <w:rFonts w:ascii="TH Sarabun New" w:eastAsia="TH Sarabun New" w:hAnsi="TH Sarabun New" w:cs="TH Sarabun New"/>
+            <w:bCs/>
+            <w:sz w:val="32"/>
+          </w:rPr>
+          <w:t>https://drive.google.com/file/d/1FWjV9ppr6lBGvpE</w:t>
+        </w:r>
+        <w:r>
+          <w:rPr>
+            <w:rStyle w:val="Hyperlink"/>
+            <w:rFonts w:ascii="TH Sarabun New" w:eastAsia="TH Sarabun New" w:hAnsi="TH Sarabun New" w:cs="TH Sarabun New"/>
+            <w:bCs/>
+            <w:sz w:val="32"/>
+          </w:rPr>
+          <w:t>C</w:t>
+        </w:r>
+        <w:r>
+          <w:rPr>
+            <w:rStyle w:val="Hyperlink"/>
+            <w:rFonts w:ascii="TH Sarabun New" w:eastAsia="TH Sarabun New" w:hAnsi="TH Sarabun New" w:cs="TH Sarabun New"/>
+            <w:bCs/>
+            <w:sz w:val="32"/>
+          </w:rPr>
+          <w:t>eogJh2ANSWvR3Jr8/view?usp=sharing</w:t>
+        </w:r>
+      </w:hyperlink>
+    </w:p>
+    <w:p>
+      <w:pPr>
+        <w:spacing w:before="280" w:after="120" w:line="276" w:lineRule="auto"/>
+      </w:pPr>
+      <w:r>
+        <w:rPr>
+          <w:rFonts w:ascii="TH Sarabun New" w:eastAsia="TH Sarabun New" w:hAnsi="TH Sarabun New" w:cs="TH Sarabun New"/>
+          <w:b/>
+          <w:sz w:val="36"/>
+        </w:rPr>
+        <w:t>Prompt AI ที่ใช้ (AI Prompts &amp; Collaboration)</w:t>
+      </w:r>
+    </w:p>
+    <w:p>
+      <w:pPr>
+        <w:spacing w:after="120" w:line="276" w:lineRule="auto"/>
+      </w:pPr>
+      <w:r>
+        <w:rPr>
+          <w:rFonts w:ascii="TH Sarabun New" w:eastAsia="TH Sarabun New" w:hAnsi="TH Sarabun New" w:cs="TH Sarabun New"/>
+          <w:sz w:val="32"/>
+        </w:rPr>
+        <w:t>ในการพัฒนาโครงงานนี้ ได้ประยุกต์ใช้ AI Assistant เพื่อร่วมพัฒนาแบบ Pair Programming ในการช่วยวิเคราะห์ฟิสิกส์ ออกแบบระบบ ตรวจสอบความถูกต้องของโค้ด และแก้ไขบั๊กที่ซับซ้อน โดยมีตัวอย่างชุดคำสั่ง (Prompts) สำคัญดังนี้:</w:t>
+      </w:r>
+    </w:p>
+    <w:p>
+      <w:pPr>
+        <w:spacing w:after="120" w:line="276" w:lineRule="auto"/>
+        <w:ind w:left="360"/>
+      </w:pPr>
+      <w:r>
+        <w:rPr>
+          <w:rFonts w:ascii="TH Sarabun New" w:eastAsia="TH Sarabun New" w:hAnsi="TH Sarabun New" w:cs="TH Sarabun New"/>
+          <w:b/>
+          <w:sz w:val="32"/>
+        </w:rPr>
+        <w:t>1. การปรับความเร็วกับดักและแก้บั๊กฟิสิกส์ (Physics &amp; Trap Tuning):</w:t>
+      </w:r>
+      <w:r>
+        <w:rPr>
+          <w:rFonts w:ascii="TH Sarabun New" w:eastAsia="TH Sarabun New" w:hAnsi="TH Sarabun New" w:cs="TH Sarabun New"/>
+          <w:b/>
+          <w:sz w:val="32"/>
+        </w:rPr>
+        <w:br/>
+      </w:r>
+      <w:r>
+        <w:rPr>
+          <w:rFonts w:ascii="TH Sarabun New" w:eastAsia="TH Sarabun New" w:hAnsi="TH Sarabun New" w:cs="TH Sarabun New"/>
+          <w:sz w:val="32"/>
+        </w:rPr>
+        <w:t>"ตอนนี้พวกกับดัก ผลไม้ และหนาม มันยังช้าอยู่อ่ะ ช่วยแก้ให้มันเร็วขึ้นในระดับ Masocore แท้ และแก้บั๊กการชนแพลตฟอร์มที่ทำให้ตัวละครเกิดอาการวาปหรือกระตุกเมื่อกระโดดเฉียงเข้าหาขอบแพลตฟอร์ม โดยให้ /plan แผนงานออกมาก่อน"</w:t>
+      </w:r>
+    </w:p>
+    <w:p>
+      <w:pPr>
+        <w:spacing w:after="120" w:line="276" w:lineRule="auto"/>
+        <w:ind w:left="360"/>
+      </w:pPr>
+      <w:r>
+        <w:rPr>
+          <w:rFonts w:ascii="TH Sarabun New" w:eastAsia="TH Sarabun New" w:hAnsi="TH Sarabun New" w:cs="TH Sarabun New"/>
+          <w:b/>
+          <w:sz w:val="32"/>
+        </w:rPr>
+        <w:t>2. การพัฒนาระบบตรวจสอบฮิตบ็อกซ์ (Hazard Debug Hitbox System):</w:t>
+      </w:r>
+      <w:r>
+        <w:rPr>
+          <w:rFonts w:ascii="TH Sarabun New" w:eastAsia="TH Sarabun New" w:hAnsi="TH Sarabun New" w:cs="TH Sarabun New"/>
+          <w:b/>
+          <w:sz w:val="32"/>
+        </w:rPr>
+        <w:br/>
+      </w:r>
+      <w:r>
+        <w:rPr>
+          <w:rFonts w:ascii="TH Sarabun New" w:eastAsia="TH Sarabun New" w:hAnsi="TH Sarabun New" w:cs="TH Sarabun New"/>
+          <w:sz w:val="32"/>
+        </w:rPr>
+        <w:t>"เพิ่ม Debug Hitbox ตอนกดปุ่มบน Keyboard (ปุ่ม H) และปุ่ม UI รูปตาบนหน้าจอ โดยพอกดแล้วให้แสดง Hitbox เฉพาะกับดักต่าง ๆ ในแมพ (หนามและผลไม้) รวมถึงกล่อง Trigger Zone ด้วย"</w:t>
+      </w:r>
+    </w:p>
+    <w:p>
+      <w:pPr>
+        <w:spacing w:after="120" w:line="276" w:lineRule="auto"/>
+        <w:ind w:left="360"/>
+      </w:pPr>
+      <w:r>
+        <w:rPr>
+          <w:rFonts w:ascii="TH Sarabun New" w:eastAsia="TH Sarabun New" w:hAnsi="TH Sarabun New" w:cs="TH Sarabun New"/>
+          <w:b/>
+          <w:sz w:val="32"/>
+        </w:rPr>
+        <w:t>3. การออกแบบและแก้ปัญหาทางเรขาคณิตของ Trigger Zone (Overlap Fixing):</w:t>
+      </w:r>
+      <w:r>
+        <w:rPr>
+          <w:rFonts w:ascii="TH Sarabun New" w:eastAsia="TH Sarabun New" w:hAnsi="TH Sarabun New" w:cs="TH Sarabun New"/>
+          <w:b/>
+          <w:sz w:val="32"/>
+        </w:rPr>
+        <w:br/>
+      </w:r>
+      <w:r>
+        <w:rPr>
+          <w:rFonts w:ascii="TH Sarabun New" w:eastAsia="TH Sarabun New" w:hAnsi="TH Sarabun New" w:cs="TH Sarabun New"/>
+          <w:sz w:val="32"/>
+        </w:rPr>
+        <w:t xml:space="preserve">"Trigger Zone แนวนอนบนแผ่นหินข้ามเหวมันซ้อนกับ Trigger Zone แนวตั้ง ช่วยแยก Trigger Zone </w:t>
+      </w:r>
+      <w:r>
+        <w:rPr>
+          <w:rFonts w:ascii="TH Sarabun New" w:eastAsia="TH Sarabun New" w:hAnsi="TH Sarabun New" w:cs="TH Sarabun New"/>
+          <w:sz w:val="32"/>
+        </w:rPr>
+        <w:lastRenderedPageBreak/>
+        <w:t>แนวนอนออกเป็น 2 ท่อนขนาบข้างเพื่อไม่ให้พิกัดซ้อนทับกัน และปรับลดความเร็วหนามสไลด์ลง 75% ให้มีจังหวะกระโดดหลบได้อย่างสมเหตุสมผล"</w:t>
+      </w:r>
+    </w:p>
+    <w:p>
+      <w:pPr>
+        <w:spacing w:after="120" w:line="276" w:lineRule="auto"/>
+        <w:ind w:left="360"/>
+      </w:pPr>
+      <w:r>
+        <w:rPr>
+          <w:rFonts w:ascii="TH Sarabun New" w:eastAsia="TH Sarabun New" w:hAnsi="TH Sarabun New" w:cs="TH Sarabun New"/>
+          <w:b/>
+          <w:sz w:val="32"/>
+        </w:rPr>
+        <w:t>4. การปรับปรุง UI และข้อมูลผู้จัดทำ (UI Polish &amp; Developer Credits):</w:t>
+      </w:r>
+      <w:r>
+        <w:rPr>
+          <w:rFonts w:ascii="TH Sarabun New" w:eastAsia="TH Sarabun New" w:hAnsi="TH Sarabun New" w:cs="TH Sarabun New"/>
+          <w:b/>
+          <w:sz w:val="32"/>
+        </w:rPr>
+        <w:br/>
+      </w:r>
+      <w:r>
+        <w:rPr>
+          <w:rFonts w:ascii="TH Sarabun New" w:eastAsia="TH Sarabun New" w:hAnsi="TH Sarabun New" w:cs="TH Sarabun New"/>
+          <w:sz w:val="32"/>
+        </w:rPr>
+        <w:t>"ในหน้า Main Menu ให้เปลี่ยนชื่อเป็น AUGUSTUS BRUTAL ตัวพิมพ์ใหญ่ทั้งหมด, ปรับปุ่ม BACK ให้เหลือเฉพาะลูกศรชี้ซ้าย, เอา Drop Shadow ของตัวหนังสือออกให้เป็นแบบ Flat คมชัด และเพิ่มรายชื่อสมาชิกกลุ่มทั้ง 2 คนลงในหน้า About"</w:t>
+      </w:r>
+    </w:p>
+    <w:p>
+      <w:pPr>
+        <w:spacing w:before="280" w:after="120" w:line="276" w:lineRule="auto"/>
+      </w:pPr>
+      <w:r>
+        <w:rPr>
+          <w:rFonts w:ascii="TH Sarabun New" w:eastAsia="TH Sarabun New" w:hAnsi="TH Sarabun New" w:cs="TH Sarabun New"/>
+          <w:b/>
+          <w:sz w:val="36"/>
+        </w:rPr>
+        <w:t>ปัญหาที่เจอ และวิธีแก้ (Problems &amp; Solutions)</w:t>
+      </w:r>
+    </w:p>
+    <w:p>
+      <w:pPr>
+        <w:spacing w:after="120" w:line="276" w:lineRule="auto"/>
+      </w:pPr>
+      <w:r>
+        <w:rPr>
+          <w:rFonts w:ascii="TH Sarabun New" w:eastAsia="TH Sarabun New" w:hAnsi="TH Sarabun New" w:cs="TH Sarabun New"/>
+          <w:sz w:val="32"/>
+        </w:rPr>
+        <w:t>ในระหว่างการพัฒนาโครงงาน พบปัญหาทางเทคนิคและได้ดำเนินการแก้ไขอย่างเป็นระบบดังนี้:</w:t>
       </w:r>
     </w:p>
     <w:p>
@@ -2108,67 +2750,70 @@
       </w:pPr>
       <w:r>
         <w:rPr>
-          <w:rFonts w:ascii="TH Sarabun New" w:hAnsi="TH Sarabun New" w:cs="TH Sarabun New" w:eastAsia="TH Sarabun New"/>
-          <w:b/>
-          <w:i w:val="0"/>
-          <w:sz w:val="32"/>
-        </w:rPr>
-        <w:t>ภาพที่ 5: ด่านที่ 2 - เขาวงกตหนามบิน (Stage 2: Spike Maze)</w:t>
-      </w:r>
-    </w:p>
-    <w:p>
-      <w:pPr>
-        <w:spacing w:before="120" w:after="80"/>
-        <w:jc w:val="center"/>
-      </w:pPr>
-      <w:r>
-        <w:drawing>
-          <wp:inline xmlns:a="http://schemas.openxmlformats.org/drawingml/2006/main" xmlns:pic="http://schemas.openxmlformats.org/drawingml/2006/picture">
-            <wp:extent cx="5029200" cy="2827778"/>
-            <wp:docPr id="5" name="Picture 5"/>
-            <wp:cNvGraphicFramePr>
-              <a:graphicFrameLocks noChangeAspect="1"/>
-            </wp:cNvGraphicFramePr>
-            <a:graphic>
-              <a:graphicData uri="http://schemas.openxmlformats.org/drawingml/2006/picture">
-                <pic:pic>
-                  <pic:nvPicPr>
-                    <pic:cNvPr id="0" name="Stage2.png"/>
-                    <pic:cNvPicPr/>
-                  </pic:nvPicPr>
-                  <pic:blipFill>
-                    <a:blip r:embed="rId12"/>
-                    <a:stretch>
-                      <a:fillRect/>
-                    </a:stretch>
-                  </pic:blipFill>
-                  <pic:spPr>
-                    <a:xfrm>
-                      <a:off x="0" y="0"/>
-                      <a:ext cx="5029200" cy="2827778"/>
-                    </a:xfrm>
-                    <a:prstGeom prst="rect"/>
-                  </pic:spPr>
-                </pic:pic>
-              </a:graphicData>
-            </a:graphic>
-          </wp:inline>
-        </w:drawing>
-      </w:r>
-    </w:p>
-    <w:p>
-      <w:pPr>
-        <w:spacing w:before="40" w:after="280"/>
-        <w:jc w:val="center"/>
-      </w:pPr>
-      <w:r>
-        <w:rPr>
-          <w:rFonts w:ascii="TH Sarabun New" w:hAnsi="TH Sarabun New" w:cs="TH Sarabun New" w:eastAsia="TH Sarabun New"/>
-          <w:b w:val="0"/>
-          <w:i/>
-          <w:sz w:val="28"/>
-        </w:rPr>
-        <w:t>คำอธิบาย: แสดงความท้าทายของด่านที่ 2 กับดักหนามพุ่งทะลุฉากด้วยความเร็วสูง (Rushers) และการควบคุมจังหวะการกระโดด Double Jump หลบหนามกลางอากาศในช่องทางแคบ</w:t>
+          <w:rFonts w:ascii="TH Sarabun New" w:eastAsia="TH Sarabun New" w:hAnsi="TH Sarabun New" w:cs="TH Sarabun New"/>
+          <w:b/>
+          <w:sz w:val="32"/>
+        </w:rPr>
+        <w:t>1. ปัญหาการชนขอบแพลตฟอร์มแล้วตัวละครกระตุกหรือวาป (Corner Snagging &amp; Seam Stuttering)</w:t>
+      </w:r>
+    </w:p>
+    <w:p>
+      <w:pPr>
+        <w:spacing w:after="120" w:line="276" w:lineRule="auto"/>
+        <w:ind w:left="360"/>
+      </w:pPr>
+      <w:r>
+        <w:rPr>
+          <w:rFonts w:ascii="TH Sarabun New" w:eastAsia="TH Sarabun New" w:hAnsi="TH Sarabun New" w:cs="TH Sarabun New"/>
+          <w:b/>
+          <w:sz w:val="32"/>
+        </w:rPr>
+        <w:t xml:space="preserve">• สาเหตุของปัญหา: </w:t>
+      </w:r>
+      <w:r>
+        <w:rPr>
+          <w:rFonts w:ascii="TH Sarabun New" w:eastAsia="TH Sarabun New" w:hAnsi="TH Sarabun New" w:cs="TH Sarabun New"/>
+          <w:sz w:val="32"/>
+        </w:rPr>
+        <w:t>การคำนวณการเคลื่อนที่ของตัวละครในแกน X และ Y พร้อมกันในขั้นตอนเดียว ทำให้เมื่อตัวละครกระโดดเฉียงเข้าหามุมกล่อง กลไก Overlap Resolution ตรวจพบการทับซ้อนและผลักตัวละครลงไปด้านล่างอย่างผิดธรรมชาติ หรือติดขัดตามรอยต่อระหว่างบล็อกที่วางเรียงติดกัน</w:t>
+      </w:r>
+    </w:p>
+    <w:p>
+      <w:pPr>
+        <w:spacing w:after="120" w:line="276" w:lineRule="auto"/>
+        <w:ind w:left="360"/>
+      </w:pPr>
+      <w:r>
+        <w:rPr>
+          <w:rFonts w:ascii="TH Sarabun New" w:eastAsia="TH Sarabun New" w:hAnsi="TH Sarabun New" w:cs="TH Sarabun New"/>
+          <w:b/>
+          <w:sz w:val="32"/>
+        </w:rPr>
+        <w:t xml:space="preserve">• แนวทางการแก้ไข: </w:t>
+      </w:r>
+      <w:r>
+        <w:rPr>
+          <w:rFonts w:ascii="TH Sarabun New" w:eastAsia="TH Sarabun New" w:hAnsi="TH Sarabun New" w:cs="TH Sarabun New"/>
+          <w:sz w:val="32"/>
+        </w:rPr>
+        <w:t>ปรับสถาปัตยกรรมการชนใน Player._moveWithCollisions ให้แยกการประมวลผลแกน X ก่อน แล้วตามด้วยแกน Y แบบ Sub-stepping พร้อมเพิ่มขอบเขตตรวจสอบมุมกล่อง ทำให้ตัวละครสามารถสไลด์เลียบผนังและก้าวข้ามรอยต่อระหว่างบล็อกได้อย่างลื่นไหล ไม่เกิดอาการกระตุกหรือดีดลงล่าง</w:t>
+      </w:r>
+    </w:p>
+    <w:p>
+      <w:pPr>
+        <w:rPr>
+          <w:rFonts w:ascii="TH Sarabun New" w:eastAsia="TH Sarabun New" w:hAnsi="TH Sarabun New" w:cs="TH Sarabun New"/>
+          <w:b/>
+          <w:sz w:val="32"/>
+        </w:rPr>
+      </w:pPr>
+      <w:r>
+        <w:rPr>
+          <w:rFonts w:ascii="TH Sarabun New" w:eastAsia="TH Sarabun New" w:hAnsi="TH Sarabun New" w:cs="TH Sarabun New"/>
+          <w:b/>
+          <w:sz w:val="32"/>
+        </w:rPr>
+        <w:br w:type="page"/>
       </w:r>
     </w:p>
     <w:p>
@@ -2177,764 +2822,252 @@
       </w:pPr>
       <w:r>
         <w:rPr>
-          <w:rFonts w:ascii="TH Sarabun New" w:hAnsi="TH Sarabun New" w:cs="TH Sarabun New" w:eastAsia="TH Sarabun New"/>
-          <w:b/>
-          <w:i w:val="0"/>
-          <w:sz w:val="32"/>
-        </w:rPr>
-        <w:t>ภาพที่ 6: ด่านที่ 3 - กระโดดวัดใจและป้อมปืนกล (Stage 3: Leap of Faith &amp; Turret Arena)</w:t>
-      </w:r>
-    </w:p>
-    <w:p>
-      <w:pPr>
-        <w:spacing w:before="120" w:after="80"/>
-        <w:jc w:val="center"/>
-      </w:pPr>
-      <w:r>
-        <w:drawing>
-          <wp:inline xmlns:a="http://schemas.openxmlformats.org/drawingml/2006/main" xmlns:pic="http://schemas.openxmlformats.org/drawingml/2006/picture">
-            <wp:extent cx="5029200" cy="2827778"/>
-            <wp:docPr id="6" name="Picture 6"/>
-            <wp:cNvGraphicFramePr>
-              <a:graphicFrameLocks noChangeAspect="1"/>
-            </wp:cNvGraphicFramePr>
-            <a:graphic>
-              <a:graphicData uri="http://schemas.openxmlformats.org/drawingml/2006/picture">
-                <pic:pic>
-                  <pic:nvPicPr>
-                    <pic:cNvPr id="0" name="Stage3.png"/>
-                    <pic:cNvPicPr/>
-                  </pic:nvPicPr>
-                  <pic:blipFill>
-                    <a:blip r:embed="rId13"/>
-                    <a:stretch>
-                      <a:fillRect/>
-                    </a:stretch>
-                  </pic:blipFill>
-                  <pic:spPr>
-                    <a:xfrm>
-                      <a:off x="0" y="0"/>
-                      <a:ext cx="5029200" cy="2827778"/>
-                    </a:xfrm>
-                    <a:prstGeom prst="rect"/>
-                  </pic:spPr>
-                </pic:pic>
-              </a:graphicData>
-            </a:graphic>
-          </wp:inline>
-        </w:drawing>
-      </w:r>
-    </w:p>
-    <w:p>
-      <w:pPr>
-        <w:spacing w:before="40" w:after="280"/>
-        <w:jc w:val="center"/>
-      </w:pPr>
-      <w:r>
-        <w:rPr>
-          <w:rFonts w:ascii="TH Sarabun New" w:hAnsi="TH Sarabun New" w:cs="TH Sarabun New" w:eastAsia="TH Sarabun New"/>
-          <w:b w:val="0"/>
-          <w:i/>
-          <w:sz w:val="28"/>
-        </w:rPr>
-        <w:t>คำอธิบาย: แสดงระบบป้อมปืนกลกวาดองศาการเล็ง (Turret Hazard), เลเซอร์สไนเปอร์ล็อกเป้า, และการกระโดดวัดใจข้ามเหวลึกผ่านแท่นกระโดดที่ต้องการความแม่นยำระดับพิกเซล</w:t>
-      </w:r>
-    </w:p>
-    <w:p>
-      <w:pPr>
-        <w:spacing w:before="280" w:after="120" w:line="276" w:lineRule="auto"/>
-      </w:pPr>
-      <w:r>
-        <w:rPr>
-          <w:rFonts w:ascii="TH Sarabun New" w:hAnsi="TH Sarabun New" w:cs="TH Sarabun New" w:eastAsia="TH Sarabun New"/>
-          <w:b/>
-          <w:i w:val="0"/>
-          <w:sz w:val="36"/>
-        </w:rPr>
-        <w:t>เครื่องมือที่ใช้ (App Inventor / Flutter)</w:t>
-      </w:r>
-    </w:p>
-    <w:p>
-      <w:pPr>
-        <w:spacing w:before="0" w:after="120" w:line="276" w:lineRule="auto"/>
-      </w:pPr>
-      <w:r>
-        <w:rPr>
-          <w:rFonts w:ascii="TH Sarabun New" w:hAnsi="TH Sarabun New" w:cs="TH Sarabun New" w:eastAsia="TH Sarabun New"/>
-          <w:b w:val="0"/>
-          <w:i w:val="0"/>
-          <w:sz w:val="32"/>
-        </w:rPr>
-        <w:t>โครงงานนี้พัฒนาด้วย Flutter Framework โดยมีรายละเอียดเครื่องมือและเทคโนโลยีที่ใช้ดังนี้:</w:t>
-      </w:r>
-    </w:p>
-    <w:p>
-      <w:pPr>
-        <w:spacing w:before="0" w:after="120" w:line="276" w:lineRule="auto"/>
+          <w:rFonts w:ascii="TH Sarabun New" w:eastAsia="TH Sarabun New" w:hAnsi="TH Sarabun New" w:cs="TH Sarabun New"/>
+          <w:b/>
+          <w:sz w:val="32"/>
+        </w:rPr>
+        <w:lastRenderedPageBreak/>
+        <w:t>2. ปัญหาวัตถุความเร็วสูงทะลุตัวละคร (Tunneling Effect)</w:t>
+      </w:r>
+    </w:p>
+    <w:p>
+      <w:pPr>
+        <w:spacing w:after="120" w:line="276" w:lineRule="auto"/>
         <w:ind w:left="360"/>
       </w:pPr>
       <w:r>
         <w:rPr>
-          <w:rFonts w:ascii="TH Sarabun New" w:hAnsi="TH Sarabun New" w:cs="TH Sarabun New" w:eastAsia="TH Sarabun New"/>
-          <w:b/>
-          <w:i w:val="0"/>
-          <w:sz w:val="32"/>
-        </w:rPr>
-        <w:t xml:space="preserve">• ภาษาที่ใช้พัฒนา: Dart 3.x - </w:t>
-      </w:r>
-      <w:r>
-        <w:rPr>
-          <w:rFonts w:ascii="TH Sarabun New" w:hAnsi="TH Sarabun New" w:cs="TH Sarabun New" w:eastAsia="TH Sarabun New"/>
-          <w:b w:val="0"/>
-          <w:i w:val="0"/>
-          <w:sz w:val="32"/>
-        </w:rPr>
-        <w:t>ภาษาโปรแกรมเชิงวัตถุประเภท Modern Strongly-Typed สำหรับพัฒนาตรรกะเกมและระบบฟิสิกส์</w:t>
-      </w:r>
-    </w:p>
-    <w:p>
-      <w:pPr>
-        <w:spacing w:before="0" w:after="120" w:line="276" w:lineRule="auto"/>
+          <w:rFonts w:ascii="TH Sarabun New" w:eastAsia="TH Sarabun New" w:hAnsi="TH Sarabun New" w:cs="TH Sarabun New"/>
+          <w:b/>
+          <w:sz w:val="32"/>
+        </w:rPr>
+        <w:t xml:space="preserve">• สาเหตุของปัญหา: </w:t>
+      </w:r>
+      <w:r>
+        <w:rPr>
+          <w:rFonts w:ascii="TH Sarabun New" w:eastAsia="TH Sarabun New" w:hAnsi="TH Sarabun New" w:cs="TH Sarabun New"/>
+          <w:sz w:val="32"/>
+        </w:rPr>
+        <w:t>กับดักหนามพุ่งและกระสุนสไนเปอร์เคลื่อนที่ด้วยความเร็วสูงมาก (1,100 - 4,500 px/s) ในกรณีที่เฟรมเรตตก (dt เพิ่มขึ้น) ระยะทางการเคลื่อนที่ใน 1 เฟรมจะกว้างกว่าขนาดตัวละคร ส่งผลให้ฮิตบ็อกซ์ข้ามตำแหน่งตัวละครไปโดยไม่เกิดการชน (Tunneling)</w:t>
+      </w:r>
+    </w:p>
+    <w:p>
+      <w:pPr>
+        <w:spacing w:after="120" w:line="276" w:lineRule="auto"/>
         <w:ind w:left="360"/>
       </w:pPr>
       <w:r>
         <w:rPr>
-          <w:rFonts w:ascii="TH Sarabun New" w:hAnsi="TH Sarabun New" w:cs="TH Sarabun New" w:eastAsia="TH Sarabun New"/>
-          <w:b/>
-          <w:i w:val="0"/>
-          <w:sz w:val="32"/>
-        </w:rPr>
-        <w:t xml:space="preserve">• เฟรมเวิร์กหลัก: Flutter 3.x - </w:t>
-      </w:r>
-      <w:r>
-        <w:rPr>
-          <w:rFonts w:ascii="TH Sarabun New" w:hAnsi="TH Sarabun New" w:cs="TH Sarabun New" w:eastAsia="TH Sarabun New"/>
-          <w:b w:val="0"/>
-          <w:i w:val="0"/>
-          <w:sz w:val="32"/>
-        </w:rPr>
-        <w:t>เฟรมเวิร์กหลักสำหรับการสร้าง User Interface ข้ามแพลตฟอร์ม (Cross-Platform) รองรับทั้ง Android, iOS, Web และ Windows</w:t>
-      </w:r>
-    </w:p>
-    <w:p>
-      <w:pPr>
-        <w:spacing w:before="0" w:after="120" w:line="276" w:lineRule="auto"/>
+          <w:rFonts w:ascii="TH Sarabun New" w:eastAsia="TH Sarabun New" w:hAnsi="TH Sarabun New" w:cs="TH Sarabun New"/>
+          <w:b/>
+          <w:sz w:val="32"/>
+        </w:rPr>
+        <w:t xml:space="preserve">• แนวทางการแก้ไข: </w:t>
+      </w:r>
+      <w:r>
+        <w:rPr>
+          <w:rFonts w:ascii="TH Sarabun New" w:eastAsia="TH Sarabun New" w:hAnsi="TH Sarabun New" w:cs="TH Sarabun New"/>
+          <w:sz w:val="32"/>
+        </w:rPr>
+        <w:t>สร้างกลไก Anti-Tunneling Detection ด้วยการทำ Continuous Sweep Detection และ Raycasting ลากเส้นตรวจสอบระหว่างตำแหน่งในเฟรมก่อนหน้าและตำแหน่งปัจจุบัน ทำให้ตรวจจับการชนได้แม่นยำ 100% แม้จะเกิดอาการแล็กชั่วขณะ</w:t>
+      </w:r>
+    </w:p>
+    <w:p>
+      <w:pPr>
+        <w:spacing w:before="200" w:after="80" w:line="276" w:lineRule="auto"/>
+      </w:pPr>
+      <w:r>
+        <w:rPr>
+          <w:rFonts w:ascii="TH Sarabun New" w:eastAsia="TH Sarabun New" w:hAnsi="TH Sarabun New" w:cs="TH Sarabun New"/>
+          <w:b/>
+          <w:sz w:val="32"/>
+        </w:rPr>
+        <w:t>3. ปัญหา Trigger Zone ซ้อนทับกันทำให้เกิดการยิงกับดักซ้ำซ้อน</w:t>
+      </w:r>
+    </w:p>
+    <w:p>
+      <w:pPr>
+        <w:spacing w:after="120" w:line="276" w:lineRule="auto"/>
         <w:ind w:left="360"/>
       </w:pPr>
       <w:r>
         <w:rPr>
-          <w:rFonts w:ascii="TH Sarabun New" w:hAnsi="TH Sarabun New" w:cs="TH Sarabun New" w:eastAsia="TH Sarabun New"/>
-          <w:b/>
-          <w:i w:val="0"/>
-          <w:sz w:val="32"/>
-        </w:rPr>
-        <w:t xml:space="preserve">• เกมเอนจิน: Flame Engine (v1.x) - </w:t>
-      </w:r>
-      <w:r>
-        <w:rPr>
-          <w:rFonts w:ascii="TH Sarabun New" w:hAnsi="TH Sarabun New" w:cs="TH Sarabun New" w:eastAsia="TH Sarabun New"/>
-          <w:b w:val="0"/>
-          <w:i w:val="0"/>
-          <w:sz w:val="32"/>
-        </w:rPr>
-        <w:t>เกมเอนจิน 2D ประสิทธิภาพสูงบน Flutter โดยใช้จัดการ Game Loop (Update &amp; Render), ระบบตรวจจับการชน (Collision Detection), และ Canvas API สำหรับการวาดกราฟิกพิกเซล</w:t>
-      </w:r>
-    </w:p>
-    <w:p>
-      <w:pPr>
-        <w:spacing w:before="0" w:after="120" w:line="276" w:lineRule="auto"/>
+          <w:rFonts w:ascii="TH Sarabun New" w:eastAsia="TH Sarabun New" w:hAnsi="TH Sarabun New" w:cs="TH Sarabun New"/>
+          <w:b/>
+          <w:sz w:val="32"/>
+        </w:rPr>
+        <w:t xml:space="preserve">• สาเหตุของปัญหา: </w:t>
+      </w:r>
+      <w:r>
+        <w:rPr>
+          <w:rFonts w:ascii="TH Sarabun New" w:eastAsia="TH Sarabun New" w:hAnsi="TH Sarabun New" w:cs="TH Sarabun New"/>
+          <w:sz w:val="32"/>
+        </w:rPr>
+        <w:t>บนแผ่นหินกลางเหวด่านที่ 1 มี Trigger Zone สองชุด คือ หนามพุ่งแนวนอนข้ามแมพ และหนามจรวดพุ่งแนวตั้งจากใต้เหว เมื่อกล่องแนวนอนพาดผ่านทั้งแผ่นหิน ทำให้จุดกึ่งกลางทับซ้อนกับกล่องแนวตั้ง เมื่อผู้เล่นเหยียบจะกระตุ้นกับดักทั้งสองพร้อมกันโดยไม่ตั้งใจ</w:t>
+      </w:r>
+    </w:p>
+    <w:p>
+      <w:pPr>
+        <w:spacing w:after="120" w:line="276" w:lineRule="auto"/>
         <w:ind w:left="360"/>
       </w:pPr>
       <w:r>
         <w:rPr>
-          <w:rFonts w:ascii="TH Sarabun New" w:hAnsi="TH Sarabun New" w:cs="TH Sarabun New" w:eastAsia="TH Sarabun New"/>
-          <w:b/>
-          <w:i w:val="0"/>
-          <w:sz w:val="32"/>
-        </w:rPr>
-        <w:t xml:space="preserve">• การจัดการเวอร์ชัน (Version Control): Git &amp; GitHub - </w:t>
-      </w:r>
-      <w:r>
-        <w:rPr>
-          <w:rFonts w:ascii="TH Sarabun New" w:hAnsi="TH Sarabun New" w:cs="TH Sarabun New" w:eastAsia="TH Sarabun New"/>
-          <w:b w:val="0"/>
-          <w:i w:val="0"/>
-          <w:sz w:val="32"/>
-        </w:rPr>
-        <w:t>ระบบควบคุมเวอร์ชันซอร์สโค้ด และจัดเก็บบนคลาวด์สำหรับทำงานร่วมกันในทีม</w:t>
-      </w:r>
-    </w:p>
-    <w:p>
-      <w:pPr>
-        <w:spacing w:before="0" w:after="120" w:line="276" w:lineRule="auto"/>
+          <w:rFonts w:ascii="TH Sarabun New" w:eastAsia="TH Sarabun New" w:hAnsi="TH Sarabun New" w:cs="TH Sarabun New"/>
+          <w:b/>
+          <w:sz w:val="32"/>
+        </w:rPr>
+        <w:t xml:space="preserve">• แนวทางการแก้ไข: </w:t>
+      </w:r>
+      <w:r>
+        <w:rPr>
+          <w:rFonts w:ascii="TH Sarabun New" w:eastAsia="TH Sarabun New" w:hAnsi="TH Sarabun New" w:cs="TH Sarabun New"/>
+          <w:sz w:val="32"/>
+        </w:rPr>
+        <w:t>ใช้ระบบ Debug Hitbox ตรวจสอบพิกัด และทำการแยก Trigger Zone แนวนอนออกเป็น 2 กล่องย่อย (ซ้าย-ขวา) ขนาบข้างกล่องแนวตั้ง ทำให้ไม่มีพื้นที่ทับซ้อนเชิงเรขาคณิต และกับดักทำงานแยกกันตามจุดที่ผู้เล่นสัมผัสอย่างแม่นยำ</w:t>
+      </w:r>
+    </w:p>
+    <w:p>
+      <w:pPr>
+        <w:spacing w:before="200" w:after="80" w:line="276" w:lineRule="auto"/>
+      </w:pPr>
+      <w:r>
+        <w:rPr>
+          <w:rFonts w:ascii="TH Sarabun New" w:eastAsia="TH Sarabun New" w:hAnsi="TH Sarabun New" w:cs="TH Sarabun New"/>
+          <w:b/>
+          <w:sz w:val="32"/>
+        </w:rPr>
+        <w:t>4. ปัญหาความเร็วของกับดักหนามสไลด์เร็วเกินกว่าปฏิกิริยาของมนุษย์</w:t>
+      </w:r>
+    </w:p>
+    <w:p>
+      <w:pPr>
+        <w:spacing w:after="120" w:line="276" w:lineRule="auto"/>
         <w:ind w:left="360"/>
       </w:pPr>
       <w:r>
         <w:rPr>
-          <w:rFonts w:ascii="TH Sarabun New" w:hAnsi="TH Sarabun New" w:cs="TH Sarabun New" w:eastAsia="TH Sarabun New"/>
-          <w:b/>
-          <w:i w:val="0"/>
-          <w:sz w:val="32"/>
-        </w:rPr>
-        <w:t xml:space="preserve">• สภาพแวดล้อมการพัฒนา (IDE): Visual Studio Code / Google Antigravity - </w:t>
-      </w:r>
-      <w:r>
-        <w:rPr>
-          <w:rFonts w:ascii="TH Sarabun New" w:hAnsi="TH Sarabun New" w:cs="TH Sarabun New" w:eastAsia="TH Sarabun New"/>
-          <w:b w:val="0"/>
-          <w:i w:val="0"/>
-          <w:sz w:val="32"/>
-        </w:rPr>
-        <w:t>โปรแกรมแก้ไขโค้ดและสภาพแวดล้อมการพัฒนาแอปพลิเคชัน</w:t>
-      </w:r>
-    </w:p>
-    <w:p>
-      <w:pPr>
-        <w:spacing w:before="0" w:after="120" w:line="276" w:lineRule="auto"/>
+          <w:rFonts w:ascii="TH Sarabun New" w:eastAsia="TH Sarabun New" w:hAnsi="TH Sarabun New" w:cs="TH Sarabun New"/>
+          <w:b/>
+          <w:sz w:val="32"/>
+        </w:rPr>
+        <w:t xml:space="preserve">• สาเหตุของปัญหา: </w:t>
+      </w:r>
+      <w:r>
+        <w:rPr>
+          <w:rFonts w:ascii="TH Sarabun New" w:eastAsia="TH Sarabun New" w:hAnsi="TH Sarabun New" w:cs="TH Sarabun New"/>
+          <w:sz w:val="32"/>
+        </w:rPr>
+        <w:t>หนามสไลด์บนแท่นบันไดวิ่งด้วยความเร็ว 450 - 480 px/s บนระยะทางสไลด์เพียง 68 พิกเซล ส่งผลให้หนามเคลื่อนที่ถึงตัวผู้เล่นภายในเวลาเพียง 0.15 วินาที ซึ่งเร็วกว่า Human Reaction Time ทำให้ผู้เล่นไม่สามารถตอบสนองได้ทัน</w:t>
+      </w:r>
+    </w:p>
+    <w:p>
+      <w:pPr>
+        <w:spacing w:after="120" w:line="276" w:lineRule="auto"/>
         <w:ind w:left="360"/>
       </w:pPr>
       <w:r>
         <w:rPr>
-          <w:rFonts w:ascii="TH Sarabun New" w:hAnsi="TH Sarabun New" w:cs="TH Sarabun New" w:eastAsia="TH Sarabun New"/>
-          <w:b/>
-          <w:i w:val="0"/>
-          <w:sz w:val="32"/>
-        </w:rPr>
-        <w:t xml:space="preserve">• เครื่องมือทดสอบและตรวจสอบคุณภาพ: flutter test &amp; flutter analyze - </w:t>
-      </w:r>
-      <w:r>
-        <w:rPr>
-          <w:rFonts w:ascii="TH Sarabun New" w:hAnsi="TH Sarabun New" w:cs="TH Sarabun New" w:eastAsia="TH Sarabun New"/>
-          <w:b w:val="0"/>
-          <w:i w:val="0"/>
-          <w:sz w:val="32"/>
-        </w:rPr>
-        <w:t>ใช้คำสั่ง flutter test ในการทำ Automated Unit Testing สำหรับฟิสิกส์และกับดัก และคำสั่ง flutter analyze ในการตรวจสอบคุณภาพและมาตรฐานของโค้ด</w:t>
-      </w:r>
-    </w:p>
-    <w:p>
-      <w:pPr>
-        <w:spacing w:before="280" w:after="120" w:line="276" w:lineRule="auto"/>
-      </w:pPr>
-      <w:r>
-        <w:rPr>
-          <w:rFonts w:ascii="TH Sarabun New" w:hAnsi="TH Sarabun New" w:cs="TH Sarabun New" w:eastAsia="TH Sarabun New"/>
-          <w:b/>
-          <w:i w:val="0"/>
-          <w:sz w:val="36"/>
-        </w:rPr>
-        <w:t>ลิงค์ repo และลิงค์วิดีโอ</w:t>
-      </w:r>
-    </w:p>
-    <w:p>
-      <w:pPr>
-        <w:spacing w:before="0" w:after="120" w:line="276" w:lineRule="auto"/>
+          <w:rFonts w:ascii="TH Sarabun New" w:eastAsia="TH Sarabun New" w:hAnsi="TH Sarabun New" w:cs="TH Sarabun New"/>
+          <w:b/>
+          <w:sz w:val="32"/>
+        </w:rPr>
+        <w:t xml:space="preserve">• แนวทางการแก้ไข: </w:t>
+      </w:r>
+      <w:r>
+        <w:rPr>
+          <w:rFonts w:ascii="TH Sarabun New" w:eastAsia="TH Sarabun New" w:hAnsi="TH Sarabun New" w:cs="TH Sarabun New"/>
+          <w:sz w:val="32"/>
+        </w:rPr>
+        <w:t>ปรับลดความเร็วลง 75% เหลือ 115 - 120 px/s ส่งผลให้หนามใช้เวลาเคลื่อนที่ราว 0.55 - 0.59 วินาที ซึ่งเป็นช่วงเวลาที่ท้าทายแต่เปิดโอกาสให้ผู้เล่นสามารถกระโดดหลบ (Dodge &amp; Jump) ได้อย่างมีชั้นเชิง</w:t>
+      </w:r>
+    </w:p>
+    <w:p>
+      <w:pPr>
+        <w:rPr>
+          <w:rFonts w:ascii="TH Sarabun New" w:eastAsia="TH Sarabun New" w:hAnsi="TH Sarabun New" w:cs="TH Sarabun New"/>
+          <w:b/>
+          <w:sz w:val="32"/>
+        </w:rPr>
+      </w:pPr>
+      <w:r>
+        <w:rPr>
+          <w:rFonts w:ascii="TH Sarabun New" w:eastAsia="TH Sarabun New" w:hAnsi="TH Sarabun New" w:cs="TH Sarabun New"/>
+          <w:b/>
+          <w:sz w:val="32"/>
+        </w:rPr>
+        <w:br w:type="page"/>
+      </w:r>
+    </w:p>
+    <w:p>
+      <w:pPr>
+        <w:spacing w:before="200" w:after="80" w:line="276" w:lineRule="auto"/>
+      </w:pPr>
+      <w:r>
+        <w:rPr>
+          <w:rFonts w:ascii="TH Sarabun New" w:eastAsia="TH Sarabun New" w:hAnsi="TH Sarabun New" w:cs="TH Sarabun New"/>
+          <w:b/>
+          <w:sz w:val="32"/>
+        </w:rPr>
+        <w:lastRenderedPageBreak/>
+        <w:t xml:space="preserve">5. </w:t>
+      </w:r>
+      <w:proofErr w:type="spellStart"/>
+      <w:r>
+        <w:rPr>
+          <w:rFonts w:ascii="TH Sarabun New" w:eastAsia="TH Sarabun New" w:hAnsi="TH Sarabun New" w:cs="TH Sarabun New"/>
+          <w:b/>
+          <w:sz w:val="32"/>
+        </w:rPr>
+        <w:t>ปัญหาตัวหนังสือในปุ่มเมนูเบลอและมีเงาซ้อนจากการใส่</w:t>
+      </w:r>
+      <w:proofErr w:type="spellEnd"/>
+      <w:r>
+        <w:rPr>
+          <w:rFonts w:ascii="TH Sarabun New" w:eastAsia="TH Sarabun New" w:hAnsi="TH Sarabun New" w:cs="TH Sarabun New"/>
+          <w:b/>
+          <w:sz w:val="32"/>
+        </w:rPr>
+        <w:t xml:space="preserve"> Drop Shadow</w:t>
+      </w:r>
+    </w:p>
+    <w:p>
+      <w:pPr>
+        <w:spacing w:after="120" w:line="276" w:lineRule="auto"/>
         <w:ind w:left="360"/>
       </w:pPr>
       <w:r>
         <w:rPr>
-          <w:rFonts w:ascii="TH Sarabun New" w:hAnsi="TH Sarabun New" w:cs="TH Sarabun New" w:eastAsia="TH Sarabun New"/>
-          <w:b/>
-          <w:i w:val="0"/>
-          <w:sz w:val="32"/>
-        </w:rPr>
-        <w:t xml:space="preserve">• ลิงก์ GitHub Repository: </w:t>
-      </w:r>
-      <w:r>
-        <w:rPr>
-          <w:rFonts w:ascii="TH Sarabun New" w:hAnsi="TH Sarabun New" w:cs="TH Sarabun New" w:eastAsia="TH Sarabun New"/>
-          <w:b w:val="0"/>
-          <w:i w:val="0"/>
-          <w:sz w:val="32"/>
-        </w:rPr>
-        <w:t>https://github.com/ChatchaiNaktae/Augustus.git</w:t>
-      </w:r>
-    </w:p>
-    <w:p>
-      <w:pPr>
-        <w:spacing w:before="0" w:after="120" w:line="276" w:lineRule="auto"/>
+          <w:rFonts w:ascii="TH Sarabun New" w:eastAsia="TH Sarabun New" w:hAnsi="TH Sarabun New" w:cs="TH Sarabun New"/>
+          <w:b/>
+          <w:sz w:val="32"/>
+        </w:rPr>
+        <w:t xml:space="preserve">• สาเหตุของปัญหา: </w:t>
+      </w:r>
+      <w:r>
+        <w:rPr>
+          <w:rFonts w:ascii="TH Sarabun New" w:eastAsia="TH Sarabun New" w:hAnsi="TH Sarabun New" w:cs="TH Sarabun New"/>
+          <w:sz w:val="32"/>
+        </w:rPr>
+        <w:t>สไตล์ข้อความเดิมของ RetroTheme.pixelText มีการกำหนดค่าเงา Shadow(offset: Offset(2, 2), color: Colors.black) ไว้ เมื่อนำมาใช้กับตัวอักษรสีดำบนปุ่มกด ทำให้เกิดเงาสีดำซ้อนกันจนตัวอักษรหนาผิดรูปและอ่านยาก</w:t>
+      </w:r>
+    </w:p>
+    <w:p>
+      <w:pPr>
+        <w:spacing w:after="120" w:line="276" w:lineRule="auto"/>
         <w:ind w:left="360"/>
       </w:pPr>
       <w:r>
         <w:rPr>
-          <w:rFonts w:ascii="TH Sarabun New" w:hAnsi="TH Sarabun New" w:cs="TH Sarabun New" w:eastAsia="TH Sarabun New"/>
-          <w:b/>
-          <w:i w:val="0"/>
-          <w:sz w:val="32"/>
-        </w:rPr>
-        <w:t xml:space="preserve">• ลิงก์วิดีโอสาธิตการเล่น (Gameplay Video): </w:t>
-      </w:r>
-      <w:r>
-        <w:rPr>
-          <w:rFonts w:ascii="TH Sarabun New" w:hAnsi="TH Sarabun New" w:cs="TH Sarabun New" w:eastAsia="TH Sarabun New"/>
-          <w:b w:val="0"/>
-          <w:i w:val="0"/>
-          <w:sz w:val="32"/>
-        </w:rPr>
-        <w:t>[ ใส่ลิงก์วิดีโอสาธิตการเล่น YouTube / Google Drive ที่นี่ ]</w:t>
-      </w:r>
-    </w:p>
-    <w:p>
-      <w:pPr>
-        <w:spacing w:before="280" w:after="120" w:line="276" w:lineRule="auto"/>
-      </w:pPr>
-      <w:r>
-        <w:rPr>
-          <w:rFonts w:ascii="TH Sarabun New" w:hAnsi="TH Sarabun New" w:cs="TH Sarabun New" w:eastAsia="TH Sarabun New"/>
-          <w:b/>
-          <w:i w:val="0"/>
-          <w:sz w:val="36"/>
-        </w:rPr>
-        <w:t>Prompt AI ที่ใช้ (AI Prompts &amp; Collaboration)</w:t>
-      </w:r>
-    </w:p>
-    <w:p>
-      <w:pPr>
-        <w:spacing w:before="0" w:after="120" w:line="276" w:lineRule="auto"/>
-      </w:pPr>
-      <w:r>
-        <w:rPr>
-          <w:rFonts w:ascii="TH Sarabun New" w:hAnsi="TH Sarabun New" w:cs="TH Sarabun New" w:eastAsia="TH Sarabun New"/>
-          <w:b w:val="0"/>
-          <w:i w:val="0"/>
-          <w:sz w:val="32"/>
-        </w:rPr>
-        <w:t>ในการพัฒนาโครงงานนี้ ได้ประยุกต์ใช้ AI Assistant เพื่อร่วมพัฒนาแบบ Pair Programming ในการช่วยวิเคราะห์ฟิสิกส์ ออกแบบระบบ ตรวจสอบความถูกต้องของโค้ด และแก้ไขบั๊กที่ซับซ้อน โดยมีตัวอย่างชุดคำสั่ง (Prompts) สำคัญดังนี้:</w:t>
-      </w:r>
-    </w:p>
-    <w:p>
-      <w:pPr>
-        <w:spacing w:before="0" w:after="120" w:line="276" w:lineRule="auto"/>
-        <w:ind w:left="360"/>
-      </w:pPr>
-      <w:r>
-        <w:rPr>
-          <w:rFonts w:ascii="TH Sarabun New" w:hAnsi="TH Sarabun New" w:cs="TH Sarabun New" w:eastAsia="TH Sarabun New"/>
-          <w:b/>
-          <w:i w:val="0"/>
-          <w:sz w:val="32"/>
-        </w:rPr>
-        <w:t>1. การปรับความเร็วกับดักและแก้บั๊กฟิสิกส์ (Physics &amp; Trap Tuning):</w:t>
-        <w:br/>
-      </w:r>
-      <w:r>
-        <w:rPr>
-          <w:rFonts w:ascii="TH Sarabun New" w:hAnsi="TH Sarabun New" w:cs="TH Sarabun New" w:eastAsia="TH Sarabun New"/>
-          <w:b w:val="0"/>
-          <w:i w:val="0"/>
-          <w:sz w:val="32"/>
-        </w:rPr>
-        <w:t>"ตอนนี้พวกกับดัก ผลไม้ และหนาม มันยังช้าอยู่อ่ะ ช่วยแก้ให้มันเร็วขึ้นในระดับ Masocore แท้ และแก้บั๊กการชนแพลตฟอร์มที่ทำให้ตัวละครเกิดอาการวาปหรือกระตุกเมื่อกระโดดเฉียงเข้าหาขอบแพลตฟอร์ม โดยให้ /plan แผนงานออกมาก่อน"</w:t>
-      </w:r>
-    </w:p>
-    <w:p>
-      <w:pPr>
-        <w:spacing w:before="0" w:after="120" w:line="276" w:lineRule="auto"/>
-        <w:ind w:left="360"/>
-      </w:pPr>
-      <w:r>
-        <w:rPr>
-          <w:rFonts w:ascii="TH Sarabun New" w:hAnsi="TH Sarabun New" w:cs="TH Sarabun New" w:eastAsia="TH Sarabun New"/>
-          <w:b/>
-          <w:i w:val="0"/>
-          <w:sz w:val="32"/>
-        </w:rPr>
-        <w:t>2. การพัฒนาระบบตรวจสอบฮิตบ็อกซ์ (Hazard Debug Hitbox System):</w:t>
-        <w:br/>
-      </w:r>
-      <w:r>
-        <w:rPr>
-          <w:rFonts w:ascii="TH Sarabun New" w:hAnsi="TH Sarabun New" w:cs="TH Sarabun New" w:eastAsia="TH Sarabun New"/>
-          <w:b w:val="0"/>
-          <w:i w:val="0"/>
-          <w:sz w:val="32"/>
-        </w:rPr>
-        <w:t>"เพิ่ม Debug Hitbox ตอนกดปุ่มบน Keyboard (ปุ่ม H) และปุ่ม UI รูปตาบนหน้าจอ โดยพอกดแล้วให้แสดง Hitbox เฉพาะกับดักต่าง ๆ ในแมพ (หนามและผลไม้) รวมถึงกล่อง Trigger Zone ด้วย"</w:t>
-      </w:r>
-    </w:p>
-    <w:p>
-      <w:pPr>
-        <w:spacing w:before="0" w:after="120" w:line="276" w:lineRule="auto"/>
-        <w:ind w:left="360"/>
-      </w:pPr>
-      <w:r>
-        <w:rPr>
-          <w:rFonts w:ascii="TH Sarabun New" w:hAnsi="TH Sarabun New" w:cs="TH Sarabun New" w:eastAsia="TH Sarabun New"/>
-          <w:b/>
-          <w:i w:val="0"/>
-          <w:sz w:val="32"/>
-        </w:rPr>
-        <w:t>3. การออกแบบและแก้ปัญหาทางเรขาคณิตของ Trigger Zone (Overlap Fixing):</w:t>
-        <w:br/>
-      </w:r>
-      <w:r>
-        <w:rPr>
-          <w:rFonts w:ascii="TH Sarabun New" w:hAnsi="TH Sarabun New" w:cs="TH Sarabun New" w:eastAsia="TH Sarabun New"/>
-          <w:b w:val="0"/>
-          <w:i w:val="0"/>
-          <w:sz w:val="32"/>
-        </w:rPr>
-        <w:t>"Trigger Zone แนวนอนบนแผ่นหินข้ามเหวมันซ้อนกับ Trigger Zone แนวตั้ง ช่วยแยก Trigger Zone แนวนอนออกเป็น 2 ท่อนขนาบข้างเพื่อไม่ให้พิกัดซ้อนทับกัน และปรับลดความเร็วหนามสไลด์ลง 75% ให้มีจังหวะกระโดดหลบได้อย่างสมเหตุสมผล"</w:t>
-      </w:r>
-    </w:p>
-    <w:p>
-      <w:pPr>
-        <w:spacing w:before="0" w:after="120" w:line="276" w:lineRule="auto"/>
-        <w:ind w:left="360"/>
-      </w:pPr>
-      <w:r>
-        <w:rPr>
-          <w:rFonts w:ascii="TH Sarabun New" w:hAnsi="TH Sarabun New" w:cs="TH Sarabun New" w:eastAsia="TH Sarabun New"/>
-          <w:b/>
-          <w:i w:val="0"/>
-          <w:sz w:val="32"/>
-        </w:rPr>
-        <w:t>4. การปรับปรุง UI และข้อมูลผู้จัดทำ (UI Polish &amp; Developer Credits):</w:t>
-        <w:br/>
-      </w:r>
-      <w:r>
-        <w:rPr>
-          <w:rFonts w:ascii="TH Sarabun New" w:hAnsi="TH Sarabun New" w:cs="TH Sarabun New" w:eastAsia="TH Sarabun New"/>
-          <w:b w:val="0"/>
-          <w:i w:val="0"/>
-          <w:sz w:val="32"/>
-        </w:rPr>
-        <w:t>"ในหน้า Main Menu ให้เปลี่ยนชื่อเป็น AUGUSTUS BRUTAL ตัวพิมพ์ใหญ่ทั้งหมด, ปรับปุ่ม BACK ให้เหลือเฉพาะลูกศรชี้ซ้าย, เอา Drop Shadow ของตัวหนังสือออกให้เป็นแบบ Flat คมชัด และเพิ่มรายชื่อสมาชิกกลุ่มทั้ง 2 คนลงในหน้า About"</w:t>
-      </w:r>
-    </w:p>
-    <w:p>
-      <w:pPr>
-        <w:spacing w:before="280" w:after="120" w:line="276" w:lineRule="auto"/>
-      </w:pPr>
-      <w:r>
-        <w:rPr>
-          <w:rFonts w:ascii="TH Sarabun New" w:hAnsi="TH Sarabun New" w:cs="TH Sarabun New" w:eastAsia="TH Sarabun New"/>
-          <w:b/>
-          <w:i w:val="0"/>
-          <w:sz w:val="36"/>
-        </w:rPr>
-        <w:t>ปัญหาที่เจอ และวิธีแก้ (Problems &amp; Solutions)</w:t>
-      </w:r>
-    </w:p>
-    <w:p>
-      <w:pPr>
-        <w:spacing w:before="0" w:after="120" w:line="276" w:lineRule="auto"/>
-      </w:pPr>
-      <w:r>
-        <w:rPr>
-          <w:rFonts w:ascii="TH Sarabun New" w:hAnsi="TH Sarabun New" w:cs="TH Sarabun New" w:eastAsia="TH Sarabun New"/>
-          <w:b w:val="0"/>
-          <w:i w:val="0"/>
-          <w:sz w:val="32"/>
-        </w:rPr>
-        <w:t>ในระหว่างการพัฒนาโครงงาน พบปัญหาทางเทคนิคและได้ดำเนินการแก้ไขอย่างเป็นระบบดังนี้:</w:t>
-      </w:r>
-    </w:p>
-    <w:p>
-      <w:pPr>
-        <w:spacing w:before="200" w:after="80" w:line="276" w:lineRule="auto"/>
-      </w:pPr>
-      <w:r>
-        <w:rPr>
-          <w:rFonts w:ascii="TH Sarabun New" w:hAnsi="TH Sarabun New" w:cs="TH Sarabun New" w:eastAsia="TH Sarabun New"/>
-          <w:b/>
-          <w:i w:val="0"/>
-          <w:sz w:val="32"/>
-        </w:rPr>
-        <w:t>1. ปัญหาการชนขอบแพลตฟอร์มแล้วตัวละครกระตุกหรือวาป (Corner Snagging &amp; Seam Stuttering)</w:t>
-      </w:r>
-    </w:p>
-    <w:p>
-      <w:pPr>
-        <w:spacing w:before="0" w:after="120" w:line="276" w:lineRule="auto"/>
-        <w:ind w:left="360"/>
-      </w:pPr>
-      <w:r>
-        <w:rPr>
-          <w:rFonts w:ascii="TH Sarabun New" w:hAnsi="TH Sarabun New" w:cs="TH Sarabun New" w:eastAsia="TH Sarabun New"/>
-          <w:b/>
-          <w:i w:val="0"/>
-          <w:sz w:val="32"/>
-        </w:rPr>
-        <w:t xml:space="preserve">• สาเหตุของปัญหา: </w:t>
-      </w:r>
-      <w:r>
-        <w:rPr>
-          <w:rFonts w:ascii="TH Sarabun New" w:hAnsi="TH Sarabun New" w:cs="TH Sarabun New" w:eastAsia="TH Sarabun New"/>
-          <w:b w:val="0"/>
-          <w:i w:val="0"/>
-          <w:sz w:val="32"/>
-        </w:rPr>
-        <w:t>การคำนวณการเคลื่อนที่ของตัวละครในแกน X และ Y พร้อมกันในขั้นตอนเดียว ทำให้เมื่อตัวละครกระโดดเฉียงเข้าหามุมกล่อง กลไก Overlap Resolution ตรวจพบการทับซ้อนและผลักตัวละครลงไปด้านล่างอย่างผิดธรรมชาติ หรือติดขัดตามรอยต่อระหว่างบล็อกที่วางเรียงติดกัน</w:t>
-      </w:r>
-    </w:p>
-    <w:p>
-      <w:pPr>
-        <w:spacing w:before="0" w:after="120" w:line="276" w:lineRule="auto"/>
-        <w:ind w:left="360"/>
-      </w:pPr>
-      <w:r>
-        <w:rPr>
-          <w:rFonts w:ascii="TH Sarabun New" w:hAnsi="TH Sarabun New" w:cs="TH Sarabun New" w:eastAsia="TH Sarabun New"/>
-          <w:b/>
-          <w:i w:val="0"/>
+          <w:rFonts w:ascii="TH Sarabun New" w:eastAsia="TH Sarabun New" w:hAnsi="TH Sarabun New" w:cs="TH Sarabun New"/>
+          <w:b/>
           <w:sz w:val="32"/>
         </w:rPr>
         <w:t xml:space="preserve">• แนวทางการแก้ไข: </w:t>
       </w:r>
       <w:r>
         <w:rPr>
-          <w:rFonts w:ascii="TH Sarabun New" w:hAnsi="TH Sarabun New" w:cs="TH Sarabun New" w:eastAsia="TH Sarabun New"/>
-          <w:b w:val="0"/>
-          <w:i w:val="0"/>
-          <w:sz w:val="32"/>
-        </w:rPr>
-        <w:t>ปรับสถาปัตยกรรมการชนใน Player._moveWithCollisions ให้แยกการประมวลผลแกน X ก่อน แล้วตามด้วยแกน Y แบบ Sub-stepping พร้อมเพิ่มขอบเขตตรวจสอบมุมกล่อง ทำให้ตัวละครสามารถสไลด์เลียบผนังและก้าวข้ามรอยต่อระหว่างบล็อกได้อย่างลื่นไหล ไม่เกิดอาการกระตุกหรือดีดลงล่าง</w:t>
-      </w:r>
-    </w:p>
-    <w:p>
-      <w:pPr>
-        <w:spacing w:before="200" w:after="80" w:line="276" w:lineRule="auto"/>
-      </w:pPr>
-      <w:r>
-        <w:rPr>
-          <w:rFonts w:ascii="TH Sarabun New" w:hAnsi="TH Sarabun New" w:cs="TH Sarabun New" w:eastAsia="TH Sarabun New"/>
-          <w:b/>
-          <w:i w:val="0"/>
-          <w:sz w:val="32"/>
-        </w:rPr>
-        <w:t>2. ปัญหาวัตถุความเร็วสูงทะลุตัวละคร (Tunneling Effect)</w:t>
-      </w:r>
-    </w:p>
-    <w:p>
-      <w:pPr>
-        <w:spacing w:before="0" w:after="120" w:line="276" w:lineRule="auto"/>
-        <w:ind w:left="360"/>
-      </w:pPr>
-      <w:r>
-        <w:rPr>
-          <w:rFonts w:ascii="TH Sarabun New" w:hAnsi="TH Sarabun New" w:cs="TH Sarabun New" w:eastAsia="TH Sarabun New"/>
-          <w:b/>
-          <w:i w:val="0"/>
-          <w:sz w:val="32"/>
-        </w:rPr>
-        <w:t xml:space="preserve">• สาเหตุของปัญหา: </w:t>
-      </w:r>
-      <w:r>
-        <w:rPr>
-          <w:rFonts w:ascii="TH Sarabun New" w:hAnsi="TH Sarabun New" w:cs="TH Sarabun New" w:eastAsia="TH Sarabun New"/>
-          <w:b w:val="0"/>
-          <w:i w:val="0"/>
-          <w:sz w:val="32"/>
-        </w:rPr>
-        <w:t>กับดักหนามพุ่งและกระสุนสไนเปอร์เคลื่อนที่ด้วยความเร็วสูงมาก (1,100 - 4,500 px/s) ในกรณีที่เฟรมเรตตก (dt เพิ่มขึ้น) ระยะทางการเคลื่อนที่ใน 1 เฟรมจะกว้างกว่าขนาดตัวละคร ส่งผลให้ฮิตบ็อกซ์ข้ามตำแหน่งตัวละครไปโดยไม่เกิดการชน (Tunneling)</w:t>
-      </w:r>
-    </w:p>
-    <w:p>
-      <w:pPr>
-        <w:spacing w:before="0" w:after="120" w:line="276" w:lineRule="auto"/>
-        <w:ind w:left="360"/>
-      </w:pPr>
-      <w:r>
-        <w:rPr>
-          <w:rFonts w:ascii="TH Sarabun New" w:hAnsi="TH Sarabun New" w:cs="TH Sarabun New" w:eastAsia="TH Sarabun New"/>
-          <w:b/>
-          <w:i w:val="0"/>
-          <w:sz w:val="32"/>
-        </w:rPr>
-        <w:t xml:space="preserve">• แนวทางการแก้ไข: </w:t>
-      </w:r>
-      <w:r>
-        <w:rPr>
-          <w:rFonts w:ascii="TH Sarabun New" w:hAnsi="TH Sarabun New" w:cs="TH Sarabun New" w:eastAsia="TH Sarabun New"/>
-          <w:b w:val="0"/>
-          <w:i w:val="0"/>
-          <w:sz w:val="32"/>
-        </w:rPr>
-        <w:t>สร้างกลไก Anti-Tunneling Detection ด้วยการทำ Continuous Sweep Detection และ Raycasting ลากเส้นตรวจสอบระหว่างตำแหน่งในเฟรมก่อนหน้าและตำแหน่งปัจจุบัน ทำให้ตรวจจับการชนได้แม่นยำ 100% แม้จะเกิดอาการแล็กชั่วขณะ</w:t>
-      </w:r>
-    </w:p>
-    <w:p>
-      <w:pPr>
-        <w:spacing w:before="200" w:after="80" w:line="276" w:lineRule="auto"/>
-      </w:pPr>
-      <w:r>
-        <w:rPr>
-          <w:rFonts w:ascii="TH Sarabun New" w:hAnsi="TH Sarabun New" w:cs="TH Sarabun New" w:eastAsia="TH Sarabun New"/>
-          <w:b/>
-          <w:i w:val="0"/>
-          <w:sz w:val="32"/>
-        </w:rPr>
-        <w:t>3. ปัญหา Trigger Zone ซ้อนทับกันทำให้เกิดการยิงกับดักซ้ำซ้อน</w:t>
-      </w:r>
-    </w:p>
-    <w:p>
-      <w:pPr>
-        <w:spacing w:before="0" w:after="120" w:line="276" w:lineRule="auto"/>
-        <w:ind w:left="360"/>
-      </w:pPr>
-      <w:r>
-        <w:rPr>
-          <w:rFonts w:ascii="TH Sarabun New" w:hAnsi="TH Sarabun New" w:cs="TH Sarabun New" w:eastAsia="TH Sarabun New"/>
-          <w:b/>
-          <w:i w:val="0"/>
-          <w:sz w:val="32"/>
-        </w:rPr>
-        <w:t xml:space="preserve">• สาเหตุของปัญหา: </w:t>
-      </w:r>
-      <w:r>
-        <w:rPr>
-          <w:rFonts w:ascii="TH Sarabun New" w:hAnsi="TH Sarabun New" w:cs="TH Sarabun New" w:eastAsia="TH Sarabun New"/>
-          <w:b w:val="0"/>
-          <w:i w:val="0"/>
-          <w:sz w:val="32"/>
-        </w:rPr>
-        <w:t>บนแผ่นหินกลางเหวด่านที่ 1 มี Trigger Zone สองชุด คือ หนามพุ่งแนวนอนข้ามแมพ และหนามจรวดพุ่งแนวตั้งจากใต้เหว เมื่อกล่องแนวนอนพาดผ่านทั้งแผ่นหิน ทำให้จุดกึ่งกลางทับซ้อนกับกล่องแนวตั้ง เมื่อผู้เล่นเหยียบจะกระตุ้นกับดักทั้งสองพร้อมกันโดยไม่ตั้งใจ</w:t>
-      </w:r>
-    </w:p>
-    <w:p>
-      <w:pPr>
-        <w:spacing w:before="0" w:after="120" w:line="276" w:lineRule="auto"/>
-        <w:ind w:left="360"/>
-      </w:pPr>
-      <w:r>
-        <w:rPr>
-          <w:rFonts w:ascii="TH Sarabun New" w:hAnsi="TH Sarabun New" w:cs="TH Sarabun New" w:eastAsia="TH Sarabun New"/>
-          <w:b/>
-          <w:i w:val="0"/>
-          <w:sz w:val="32"/>
-        </w:rPr>
-        <w:t xml:space="preserve">• แนวทางการแก้ไข: </w:t>
-      </w:r>
-      <w:r>
-        <w:rPr>
-          <w:rFonts w:ascii="TH Sarabun New" w:hAnsi="TH Sarabun New" w:cs="TH Sarabun New" w:eastAsia="TH Sarabun New"/>
-          <w:b w:val="0"/>
-          <w:i w:val="0"/>
-          <w:sz w:val="32"/>
-        </w:rPr>
-        <w:t>ใช้ระบบ Debug Hitbox ตรวจสอบพิกัด และทำการแยก Trigger Zone แนวนอนออกเป็น 2 กล่องย่อย (ซ้าย-ขวา) ขนาบข้างกล่องแนวตั้ง ทำให้ไม่มีพื้นที่ทับซ้อนเชิงเรขาคณิต และกับดักทำงานแยกกันตามจุดที่ผู้เล่นสัมผัสอย่างแม่นยำ</w:t>
-      </w:r>
-    </w:p>
-    <w:p>
-      <w:pPr>
-        <w:spacing w:before="200" w:after="80" w:line="276" w:lineRule="auto"/>
-      </w:pPr>
-      <w:r>
-        <w:rPr>
-          <w:rFonts w:ascii="TH Sarabun New" w:hAnsi="TH Sarabun New" w:cs="TH Sarabun New" w:eastAsia="TH Sarabun New"/>
-          <w:b/>
-          <w:i w:val="0"/>
-          <w:sz w:val="32"/>
-        </w:rPr>
-        <w:t>4. ปัญหาความเร็วของกับดักหนามสไลด์เร็วเกินกว่าปฏิกิริยาของมนุษย์</w:t>
-      </w:r>
-    </w:p>
-    <w:p>
-      <w:pPr>
-        <w:spacing w:before="0" w:after="120" w:line="276" w:lineRule="auto"/>
-        <w:ind w:left="360"/>
-      </w:pPr>
-      <w:r>
-        <w:rPr>
-          <w:rFonts w:ascii="TH Sarabun New" w:hAnsi="TH Sarabun New" w:cs="TH Sarabun New" w:eastAsia="TH Sarabun New"/>
-          <w:b/>
-          <w:i w:val="0"/>
-          <w:sz w:val="32"/>
-        </w:rPr>
-        <w:t xml:space="preserve">• สาเหตุของปัญหา: </w:t>
-      </w:r>
-      <w:r>
-        <w:rPr>
-          <w:rFonts w:ascii="TH Sarabun New" w:hAnsi="TH Sarabun New" w:cs="TH Sarabun New" w:eastAsia="TH Sarabun New"/>
-          <w:b w:val="0"/>
-          <w:i w:val="0"/>
-          <w:sz w:val="32"/>
-        </w:rPr>
-        <w:t>หนามสไลด์บนแท่นบันไดวิ่งด้วยความเร็ว 450 - 480 px/s บนระยะทางสไลด์เพียง 68 พิกเซล ส่งผลให้หนามเคลื่อนที่ถึงตัวผู้เล่นภายในเวลาเพียง 0.15 วินาที ซึ่งเร็วกว่า Human Reaction Time ทำให้ผู้เล่นไม่สามารถตอบสนองได้ทัน</w:t>
-      </w:r>
-    </w:p>
-    <w:p>
-      <w:pPr>
-        <w:spacing w:before="0" w:after="120" w:line="276" w:lineRule="auto"/>
-        <w:ind w:left="360"/>
-      </w:pPr>
-      <w:r>
-        <w:rPr>
-          <w:rFonts w:ascii="TH Sarabun New" w:hAnsi="TH Sarabun New" w:cs="TH Sarabun New" w:eastAsia="TH Sarabun New"/>
-          <w:b/>
-          <w:i w:val="0"/>
-          <w:sz w:val="32"/>
-        </w:rPr>
-        <w:t xml:space="preserve">• แนวทางการแก้ไข: </w:t>
-      </w:r>
-      <w:r>
-        <w:rPr>
-          <w:rFonts w:ascii="TH Sarabun New" w:hAnsi="TH Sarabun New" w:cs="TH Sarabun New" w:eastAsia="TH Sarabun New"/>
-          <w:b w:val="0"/>
-          <w:i w:val="0"/>
-          <w:sz w:val="32"/>
-        </w:rPr>
-        <w:t>ปรับลดความเร็วลง 75% เหลือ 115 - 120 px/s ส่งผลให้หนามใช้เวลาเคลื่อนที่ราว 0.55 - 0.59 วินาที ซึ่งเป็นช่วงเวลาที่ท้าทายแต่เปิดโอกาสให้ผู้เล่นสามารถกระโดดหลบ (Dodge &amp; Jump) ได้อย่างมีชั้นเชิง</w:t>
-      </w:r>
-    </w:p>
-    <w:p>
-      <w:pPr>
-        <w:spacing w:before="200" w:after="80" w:line="276" w:lineRule="auto"/>
-      </w:pPr>
-      <w:r>
-        <w:rPr>
-          <w:rFonts w:ascii="TH Sarabun New" w:hAnsi="TH Sarabun New" w:cs="TH Sarabun New" w:eastAsia="TH Sarabun New"/>
-          <w:b/>
-          <w:i w:val="0"/>
-          <w:sz w:val="32"/>
-        </w:rPr>
-        <w:t>5. ปัญหาตัวหนังสือในปุ่มเมนูเบลอและมีเงาซ้อนจากการใส่ Drop Shadow</w:t>
-      </w:r>
-    </w:p>
-    <w:p>
-      <w:pPr>
-        <w:spacing w:before="0" w:after="120" w:line="276" w:lineRule="auto"/>
-        <w:ind w:left="360"/>
-      </w:pPr>
-      <w:r>
-        <w:rPr>
-          <w:rFonts w:ascii="TH Sarabun New" w:hAnsi="TH Sarabun New" w:cs="TH Sarabun New" w:eastAsia="TH Sarabun New"/>
-          <w:b/>
-          <w:i w:val="0"/>
-          <w:sz w:val="32"/>
-        </w:rPr>
-        <w:t xml:space="preserve">• สาเหตุของปัญหา: </w:t>
-      </w:r>
-      <w:r>
-        <w:rPr>
-          <w:rFonts w:ascii="TH Sarabun New" w:hAnsi="TH Sarabun New" w:cs="TH Sarabun New" w:eastAsia="TH Sarabun New"/>
-          <w:b w:val="0"/>
-          <w:i w:val="0"/>
-          <w:sz w:val="32"/>
-        </w:rPr>
-        <w:t>สไตล์ข้อความเดิมของ RetroTheme.pixelText มีการกำหนดค่าเงา Shadow(offset: Offset(2, 2), color: Colors.black) ไว้ เมื่อนำมาใช้กับตัวอักษรสีดำบนปุ่มกด ทำให้เกิดเงาสีดำซ้อนกันจนตัวอักษรหนาผิดรูปและอ่านยาก</w:t>
-      </w:r>
-    </w:p>
-    <w:p>
-      <w:pPr>
-        <w:spacing w:before="0" w:after="120" w:line="276" w:lineRule="auto"/>
-        <w:ind w:left="360"/>
-      </w:pPr>
-      <w:r>
-        <w:rPr>
-          <w:rFonts w:ascii="TH Sarabun New" w:hAnsi="TH Sarabun New" w:cs="TH Sarabun New" w:eastAsia="TH Sarabun New"/>
-          <w:b/>
-          <w:i w:val="0"/>
-          <w:sz w:val="32"/>
-        </w:rPr>
-        <w:t xml:space="preserve">• แนวทางการแก้ไข: </w:t>
-      </w:r>
-      <w:r>
-        <w:rPr>
-          <w:rFonts w:ascii="TH Sarabun New" w:hAnsi="TH Sarabun New" w:cs="TH Sarabun New" w:eastAsia="TH Sarabun New"/>
-          <w:b w:val="0"/>
-          <w:i w:val="0"/>
+          <w:rFonts w:ascii="TH Sarabun New" w:eastAsia="TH Sarabun New" w:hAnsi="TH Sarabun New" w:cs="TH Sarabun New"/>
           <w:sz w:val="32"/>
         </w:rPr>
         <w:t>เพิ่มคุณสมบัติ hasTextShadow ให้กับ RetroButton และฟังก์ชันสร้างสไตล์ข้อความ โดยปิด Drop Shadow ของตัวหนังสือในหน้าเมนูหลักทั้งหมด คงไว้เฉพาะสไตล์ Flat Pixel Art ที่คมชัด สบายตา และอ่านง่ายในทุกขนาดหน้าจอ</w:t>
@@ -4150,6 +4283,7 @@
   <w:style w:type="character" w:default="1" w:styleId="DefaultParagraphFont">
     <w:name w:val="Default Paragraph Font"/>
     <w:uiPriority w:val="1"/>
+    <w:semiHidden/>
     <w:unhideWhenUsed/>
   </w:style>
   <w:style w:type="table" w:default="1" w:styleId="TableNormal">
@@ -4474,6 +4608,41 @@
       <w:bCs/>
     </w:rPr>
   </w:style>
+  <w:style w:type="character" w:styleId="Hyperlink">
+    <w:name w:val="Hyperlink"/>
+    <w:basedOn w:val="DefaultParagraphFont"/>
+    <w:uiPriority w:val="99"/>
+    <w:unhideWhenUsed/>
+    <w:rsid w:val="00B43F75"/>
+    <w:rPr>
+      <w:color w:val="467886" w:themeColor="hyperlink"/>
+      <w:u w:val="single"/>
+    </w:rPr>
+  </w:style>
+  <w:style w:type="character" w:styleId="UnresolvedMention">
+    <w:name w:val="Unresolved Mention"/>
+    <w:basedOn w:val="DefaultParagraphFont"/>
+    <w:uiPriority w:val="99"/>
+    <w:semiHidden/>
+    <w:unhideWhenUsed/>
+    <w:rsid w:val="00B43F75"/>
+    <w:rPr>
+      <w:color w:val="605E5C"/>
+      <w:shd w:val="clear" w:color="auto" w:fill="E1DFDD"/>
+    </w:rPr>
+  </w:style>
+  <w:style w:type="character" w:styleId="FollowedHyperlink">
+    <w:name w:val="FollowedHyperlink"/>
+    <w:basedOn w:val="DefaultParagraphFont"/>
+    <w:uiPriority w:val="99"/>
+    <w:semiHidden/>
+    <w:unhideWhenUsed/>
+    <w:rsid w:val="00B43F75"/>
+    <w:rPr>
+      <w:color w:val="96607D" w:themeColor="followedHyperlink"/>
+      <w:u w:val="single"/>
+    </w:rPr>
+  </w:style>
 </w:styles>
 </file>
 

</xml_diff>